<commit_message>
docs: integrate official Machine Learning COs (CO1-CO6) and NBA Tier-I POs (PO1-PO11)
</commit_message>
<xml_diff>
--- a/artifacts/reports/ML_Project_Documentation_Email_Spam_Detection.docx
+++ b/artifacts/reports/ML_Project_Documentation_Email_Spam_Detection.docx
@@ -3079,7 +3079,13 @@
         <w:spacing w:after="120" w:line="276" w:lineRule="auto"/>
         <w:jc w:val="both"/>
       </w:pPr>
-      <w:r/>
+      <w:r>
+        <w:rPr>
+          <w:rFonts w:ascii="Times New Roman" w:hAnsi="Times New Roman"/>
+          <w:sz w:val="24"/>
+        </w:rPr>
+        <w:t>This section presents the comprehensive outcome mapping for the Machine Learning course. The six Course Outcomes (COs) defined for the course are mapped to the eleven National Board of Accreditation (NBA SAR – Tier I) Programme Outcomes (POs) and two Programme Specific Outcomes (PSOs). The alignment demonstrates how statistical analysis, data preprocessing, supervised learning, parameter tuning, unsupervised grouping, and comparative mini-project evaluation substantiate each graduate attribute.</w:t>
+      </w:r>
     </w:p>
     <w:p>
       <w:pPr>
@@ -3234,12 +3240,13 @@
           <w:p>
             <w:pPr>
               <w:spacing w:before="40" w:after="40"/>
-            </w:pPr>
-            <w:r/>
-            <w:r>
-              <w:rPr>
-                <w:rFonts w:ascii="Times New Roman" w:hAnsi="Times New Roman"/>
-                <w:b w:val="0"/>
+              <w:jc w:val="center"/>
+            </w:pPr>
+            <w:r/>
+            <w:r>
+              <w:rPr>
+                <w:rFonts w:ascii="Times New Roman" w:hAnsi="Times New Roman"/>
+                <w:b/>
                 <w:i w:val="0"/>
                 <w:sz w:val="19"/>
               </w:rPr>
@@ -3255,16 +3262,17 @@
           <w:p>
             <w:pPr>
               <w:spacing w:before="40" w:after="40"/>
-            </w:pPr>
-            <w:r/>
-            <w:r>
-              <w:rPr>
-                <w:rFonts w:ascii="Times New Roman" w:hAnsi="Times New Roman"/>
-                <w:b w:val="0"/>
-                <w:i w:val="0"/>
-                <w:sz w:val="19"/>
-              </w:rPr>
-              <w:t>Understand and implement natural language text normalization and TF-IDF representations.</w:t>
+              <w:jc w:val="left"/>
+            </w:pPr>
+            <w:r/>
+            <w:r>
+              <w:rPr>
+                <w:rFonts w:ascii="Times New Roman" w:hAnsi="Times New Roman"/>
+                <w:b w:val="0"/>
+                <w:i w:val="0"/>
+                <w:sz w:val="19"/>
+              </w:rPr>
+              <w:t>Compute central tendency and dispersion measures (Mean, Median, Mode, Variance, Standard Deviation) on datasets using Python and statistical libraries.</w:t>
             </w:r>
           </w:p>
         </w:tc>
@@ -3276,16 +3284,17 @@
           <w:p>
             <w:pPr>
               <w:spacing w:before="40" w:after="40"/>
-            </w:pPr>
-            <w:r/>
-            <w:r>
-              <w:rPr>
-                <w:rFonts w:ascii="Times New Roman" w:hAnsi="Times New Roman"/>
-                <w:b w:val="0"/>
-                <w:i w:val="0"/>
-                <w:sz w:val="19"/>
-              </w:rPr>
-              <w:t>L2 (Understand)</w:t>
+              <w:jc w:val="center"/>
+            </w:pPr>
+            <w:r/>
+            <w:r>
+              <w:rPr>
+                <w:rFonts w:ascii="Times New Roman" w:hAnsi="Times New Roman"/>
+                <w:b w:val="0"/>
+                <w:i w:val="0"/>
+                <w:sz w:val="19"/>
+              </w:rPr>
+              <w:t>L3 (Apply)</w:t>
             </w:r>
           </w:p>
         </w:tc>
@@ -3297,16 +3306,17 @@
           <w:p>
             <w:pPr>
               <w:spacing w:before="40" w:after="40"/>
-            </w:pPr>
-            <w:r/>
-            <w:r>
-              <w:rPr>
-                <w:rFonts w:ascii="Times New Roman" w:hAnsi="Times New Roman"/>
-                <w:b w:val="0"/>
-                <w:i w:val="0"/>
-                <w:sz w:val="19"/>
-              </w:rPr>
-              <w:t>Chapters 1 &amp; 4</w:t>
+              <w:jc w:val="left"/>
+            </w:pPr>
+            <w:r/>
+            <w:r>
+              <w:rPr>
+                <w:rFonts w:ascii="Times New Roman" w:hAnsi="Times New Roman"/>
+                <w:b w:val="0"/>
+                <w:i w:val="0"/>
+                <w:sz w:val="19"/>
+              </w:rPr>
+              <w:t>Chapter 3 (EDA &amp; Statistical Summary)</w:t>
             </w:r>
           </w:p>
         </w:tc>
@@ -3325,12 +3335,13 @@
           <w:p>
             <w:pPr>
               <w:spacing w:before="40" w:after="40"/>
-            </w:pPr>
-            <w:r/>
-            <w:r>
-              <w:rPr>
-                <w:rFonts w:ascii="Times New Roman" w:hAnsi="Times New Roman"/>
-                <w:b w:val="0"/>
+              <w:jc w:val="center"/>
+            </w:pPr>
+            <w:r/>
+            <w:r>
+              <w:rPr>
+                <w:rFonts w:ascii="Times New Roman" w:hAnsi="Times New Roman"/>
+                <w:b/>
                 <w:i w:val="0"/>
                 <w:sz w:val="19"/>
               </w:rPr>
@@ -3346,16 +3357,17 @@
           <w:p>
             <w:pPr>
               <w:spacing w:before="40" w:after="40"/>
-            </w:pPr>
-            <w:r/>
-            <w:r>
-              <w:rPr>
-                <w:rFonts w:ascii="Times New Roman" w:hAnsi="Times New Roman"/>
-                <w:b w:val="0"/>
-                <w:i w:val="0"/>
-                <w:sz w:val="19"/>
-              </w:rPr>
-              <w:t>Formulate and train supervised machine learning models for binary spam classification.</w:t>
+              <w:jc w:val="left"/>
+            </w:pPr>
+            <w:r/>
+            <w:r>
+              <w:rPr>
+                <w:rFonts w:ascii="Times New Roman" w:hAnsi="Times New Roman"/>
+                <w:b w:val="0"/>
+                <w:i w:val="0"/>
+                <w:sz w:val="19"/>
+              </w:rPr>
+              <w:t>Utilize Python libraries such as NumPy, SciPy, Pandas, Matplotlib, and Seaborn for data manipulation, visualization, and exploratory data analysis.</w:t>
             </w:r>
           </w:p>
         </w:tc>
@@ -3367,6 +3379,7 @@
           <w:p>
             <w:pPr>
               <w:spacing w:before="40" w:after="40"/>
+              <w:jc w:val="center"/>
             </w:pPr>
             <w:r/>
             <w:r>
@@ -3388,16 +3401,17 @@
           <w:p>
             <w:pPr>
               <w:spacing w:before="40" w:after="40"/>
-            </w:pPr>
-            <w:r/>
-            <w:r>
-              <w:rPr>
-                <w:rFonts w:ascii="Times New Roman" w:hAnsi="Times New Roman"/>
-                <w:b w:val="0"/>
-                <w:i w:val="0"/>
-                <w:sz w:val="19"/>
-              </w:rPr>
-              <w:t>Chapters 5 &amp; 6</w:t>
+              <w:jc w:val="left"/>
+            </w:pPr>
+            <w:r/>
+            <w:r>
+              <w:rPr>
+                <w:rFonts w:ascii="Times New Roman" w:hAnsi="Times New Roman"/>
+                <w:b w:val="0"/>
+                <w:i w:val="0"/>
+                <w:sz w:val="19"/>
+              </w:rPr>
+              <w:t>Chapters 3 &amp; 4 (Data Preprocessing &amp; Visualizations)</w:t>
             </w:r>
           </w:p>
         </w:tc>
@@ -3416,12 +3430,13 @@
           <w:p>
             <w:pPr>
               <w:spacing w:before="40" w:after="40"/>
-            </w:pPr>
-            <w:r/>
-            <w:r>
-              <w:rPr>
-                <w:rFonts w:ascii="Times New Roman" w:hAnsi="Times New Roman"/>
-                <w:b w:val="0"/>
+              <w:jc w:val="center"/>
+            </w:pPr>
+            <w:r/>
+            <w:r>
+              <w:rPr>
+                <w:rFonts w:ascii="Times New Roman" w:hAnsi="Times New Roman"/>
+                <w:b/>
                 <w:i w:val="0"/>
                 <w:sz w:val="19"/>
               </w:rPr>
@@ -3437,16 +3452,17 @@
           <w:p>
             <w:pPr>
               <w:spacing w:before="40" w:after="40"/>
-            </w:pPr>
-            <w:r/>
-            <w:r>
-              <w:rPr>
-                <w:rFonts w:ascii="Times New Roman" w:hAnsi="Times New Roman"/>
-                <w:b w:val="0"/>
-                <w:i w:val="0"/>
-                <w:sz w:val="19"/>
-              </w:rPr>
-              <w:t>Evaluate and benchmark classification performance using cost-sensitive precision metrics.</w:t>
+              <w:jc w:val="left"/>
+            </w:pPr>
+            <w:r/>
+            <w:r>
+              <w:rPr>
+                <w:rFonts w:ascii="Times New Roman" w:hAnsi="Times New Roman"/>
+                <w:b w:val="0"/>
+                <w:i w:val="0"/>
+                <w:sz w:val="19"/>
+              </w:rPr>
+              <w:t>Implement supervised learning algorithms including Simple Linear Regression, Multiple Linear Regression, Logistic Regression, Decision Trees, and K-Nearest Neighbors (KNN) using scikit-learn.</w:t>
             </w:r>
           </w:p>
         </w:tc>
@@ -3458,16 +3474,17 @@
           <w:p>
             <w:pPr>
               <w:spacing w:before="40" w:after="40"/>
-            </w:pPr>
-            <w:r/>
-            <w:r>
-              <w:rPr>
-                <w:rFonts w:ascii="Times New Roman" w:hAnsi="Times New Roman"/>
-                <w:b w:val="0"/>
-                <w:i w:val="0"/>
-                <w:sz w:val="19"/>
-              </w:rPr>
-              <w:t>L4 (Analyse)</w:t>
+              <w:jc w:val="center"/>
+            </w:pPr>
+            <w:r/>
+            <w:r>
+              <w:rPr>
+                <w:rFonts w:ascii="Times New Roman" w:hAnsi="Times New Roman"/>
+                <w:b w:val="0"/>
+                <w:i w:val="0"/>
+                <w:sz w:val="19"/>
+              </w:rPr>
+              <w:t>L3 (Apply)</w:t>
             </w:r>
           </w:p>
         </w:tc>
@@ -3479,16 +3496,17 @@
           <w:p>
             <w:pPr>
               <w:spacing w:before="40" w:after="40"/>
-            </w:pPr>
-            <w:r/>
-            <w:r>
-              <w:rPr>
-                <w:rFonts w:ascii="Times New Roman" w:hAnsi="Times New Roman"/>
-                <w:b w:val="0"/>
-                <w:i w:val="0"/>
-                <w:sz w:val="19"/>
-              </w:rPr>
-              <w:t>Chapter 7</w:t>
+              <w:jc w:val="left"/>
+            </w:pPr>
+            <w:r/>
+            <w:r>
+              <w:rPr>
+                <w:rFonts w:ascii="Times New Roman" w:hAnsi="Times New Roman"/>
+                <w:b w:val="0"/>
+                <w:i w:val="0"/>
+                <w:sz w:val="19"/>
+              </w:rPr>
+              <w:t>Chapters 5 &amp; 6 (Logistic Regression, Decision Trees / Random Forest, Naive Bayes)</w:t>
             </w:r>
           </w:p>
         </w:tc>
@@ -3507,12 +3525,13 @@
           <w:p>
             <w:pPr>
               <w:spacing w:before="40" w:after="40"/>
-            </w:pPr>
-            <w:r/>
-            <w:r>
-              <w:rPr>
-                <w:rFonts w:ascii="Times New Roman" w:hAnsi="Times New Roman"/>
-                <w:b w:val="0"/>
+              <w:jc w:val="center"/>
+            </w:pPr>
+            <w:r/>
+            <w:r>
+              <w:rPr>
+                <w:rFonts w:ascii="Times New Roman" w:hAnsi="Times New Roman"/>
+                <w:b/>
                 <w:i w:val="0"/>
                 <w:sz w:val="19"/>
               </w:rPr>
@@ -3528,16 +3547,17 @@
           <w:p>
             <w:pPr>
               <w:spacing w:before="40" w:after="40"/>
-            </w:pPr>
-            <w:r/>
-            <w:r>
-              <w:rPr>
-                <w:rFonts w:ascii="Times New Roman" w:hAnsi="Times New Roman"/>
-                <w:b w:val="0"/>
-                <w:i w:val="0"/>
-                <w:sz w:val="19"/>
-              </w:rPr>
-              <w:t>Analyze responsible AI ethics, data privacy, and deploy real-time interactive inference.</w:t>
+              <w:jc w:val="left"/>
+            </w:pPr>
+            <w:r/>
+            <w:r>
+              <w:rPr>
+                <w:rFonts w:ascii="Times New Roman" w:hAnsi="Times New Roman"/>
+                <w:b w:val="0"/>
+                <w:i w:val="0"/>
+                <w:sz w:val="19"/>
+              </w:rPr>
+              <w:t>Apply parameter tuning and performance evaluation techniques for regression and classification models built with scikit-learn.</w:t>
             </w:r>
           </w:p>
         </w:tc>
@@ -3549,6 +3569,7 @@
           <w:p>
             <w:pPr>
               <w:spacing w:before="40" w:after="40"/>
+              <w:jc w:val="center"/>
             </w:pPr>
             <w:r/>
             <w:r>
@@ -3570,16 +3591,189 @@
           <w:p>
             <w:pPr>
               <w:spacing w:before="40" w:after="40"/>
-            </w:pPr>
-            <w:r/>
-            <w:r>
-              <w:rPr>
-                <w:rFonts w:ascii="Times New Roman" w:hAnsi="Times New Roman"/>
-                <w:b w:val="0"/>
-                <w:i w:val="0"/>
-                <w:sz w:val="19"/>
-              </w:rPr>
-              <w:t>Chapter 8 &amp; App</w:t>
+              <w:jc w:val="left"/>
+            </w:pPr>
+            <w:r/>
+            <w:r>
+              <w:rPr>
+                <w:rFonts w:ascii="Times New Roman" w:hAnsi="Times New Roman"/>
+                <w:b w:val="0"/>
+                <w:i w:val="0"/>
+                <w:sz w:val="19"/>
+              </w:rPr>
+              <w:t>Chapters 6 &amp; 7 (Grid Search, Laplace Tuning, Precision, Recall, ROC-AUC)</w:t>
+            </w:r>
+          </w:p>
+        </w:tc>
+      </w:tr>
+      <w:tr>
+        <w:tc>
+          <w:tcPr>
+            <w:tcW w:type="dxa" w:w="1000"/>
+          </w:tcPr>
+          <w:p>
+            <w:pPr>
+              <w:spacing w:before="40" w:after="40"/>
+              <w:jc w:val="center"/>
+            </w:pPr>
+            <w:r/>
+            <w:r>
+              <w:rPr>
+                <w:rFonts w:ascii="Times New Roman" w:hAnsi="Times New Roman"/>
+                <w:b/>
+                <w:i w:val="0"/>
+                <w:sz w:val="19"/>
+              </w:rPr>
+              <w:t>CO5</w:t>
+            </w:r>
+          </w:p>
+        </w:tc>
+        <w:tc>
+          <w:tcPr>
+            <w:tcW w:type="dxa" w:w="5400"/>
+          </w:tcPr>
+          <w:p>
+            <w:pPr>
+              <w:spacing w:before="40" w:after="40"/>
+              <w:jc w:val="left"/>
+            </w:pPr>
+            <w:r/>
+            <w:r>
+              <w:rPr>
+                <w:rFonts w:ascii="Times New Roman" w:hAnsi="Times New Roman"/>
+                <w:b w:val="0"/>
+                <w:i w:val="0"/>
+                <w:sz w:val="19"/>
+              </w:rPr>
+              <w:t>Implement unsupervised learning algorithms such as K-Means Clustering using scikit-learn for grouping unlabeled data.</w:t>
+            </w:r>
+          </w:p>
+        </w:tc>
+        <w:tc>
+          <w:tcPr>
+            <w:tcW w:type="dxa" w:w="1500"/>
+          </w:tcPr>
+          <w:p>
+            <w:pPr>
+              <w:spacing w:before="40" w:after="40"/>
+              <w:jc w:val="center"/>
+            </w:pPr>
+            <w:r/>
+            <w:r>
+              <w:rPr>
+                <w:rFonts w:ascii="Times New Roman" w:hAnsi="Times New Roman"/>
+                <w:b w:val="0"/>
+                <w:i w:val="0"/>
+                <w:sz w:val="19"/>
+              </w:rPr>
+              <w:t>L3 (Apply)</w:t>
+            </w:r>
+          </w:p>
+        </w:tc>
+        <w:tc>
+          <w:tcPr>
+            <w:tcW w:type="dxa" w:w="2100"/>
+          </w:tcPr>
+          <w:p>
+            <w:pPr>
+              <w:spacing w:before="40" w:after="40"/>
+              <w:jc w:val="left"/>
+            </w:pPr>
+            <w:r/>
+            <w:r>
+              <w:rPr>
+                <w:rFonts w:ascii="Times New Roman" w:hAnsi="Times New Roman"/>
+                <w:b w:val="0"/>
+                <w:i w:val="0"/>
+                <w:sz w:val="19"/>
+              </w:rPr>
+              <w:t>Chapters 5 &amp; 7 (Unsupervised Document Clustering Analysis)</w:t>
+            </w:r>
+          </w:p>
+        </w:tc>
+      </w:tr>
+      <w:tr>
+        <w:tc>
+          <w:tcPr>
+            <w:tcW w:type="dxa" w:w="1000"/>
+          </w:tcPr>
+          <w:p>
+            <w:pPr>
+              <w:spacing w:before="40" w:after="40"/>
+              <w:jc w:val="center"/>
+            </w:pPr>
+            <w:r/>
+            <w:r>
+              <w:rPr>
+                <w:rFonts w:ascii="Times New Roman" w:hAnsi="Times New Roman"/>
+                <w:b/>
+                <w:i w:val="0"/>
+                <w:sz w:val="19"/>
+              </w:rPr>
+              <w:t>CO6</w:t>
+            </w:r>
+          </w:p>
+        </w:tc>
+        <w:tc>
+          <w:tcPr>
+            <w:tcW w:type="dxa" w:w="5400"/>
+          </w:tcPr>
+          <w:p>
+            <w:pPr>
+              <w:spacing w:before="40" w:after="40"/>
+              <w:jc w:val="left"/>
+            </w:pPr>
+            <w:r/>
+            <w:r>
+              <w:rPr>
+                <w:rFonts w:ascii="Times New Roman" w:hAnsi="Times New Roman"/>
+                <w:b w:val="0"/>
+                <w:i w:val="0"/>
+                <w:sz w:val="19"/>
+              </w:rPr>
+              <w:t>Analyze and compare the performance of different classification algorithms on a given dataset through a mini-project.</w:t>
+            </w:r>
+          </w:p>
+        </w:tc>
+        <w:tc>
+          <w:tcPr>
+            <w:tcW w:type="dxa" w:w="1500"/>
+          </w:tcPr>
+          <w:p>
+            <w:pPr>
+              <w:spacing w:before="40" w:after="40"/>
+              <w:jc w:val="center"/>
+            </w:pPr>
+            <w:r/>
+            <w:r>
+              <w:rPr>
+                <w:rFonts w:ascii="Times New Roman" w:hAnsi="Times New Roman"/>
+                <w:b w:val="0"/>
+                <w:i w:val="0"/>
+                <w:sz w:val="19"/>
+              </w:rPr>
+              <w:t>L5 (Evaluate) / L6 (Create)</w:t>
+            </w:r>
+          </w:p>
+        </w:tc>
+        <w:tc>
+          <w:tcPr>
+            <w:tcW w:type="dxa" w:w="2100"/>
+          </w:tcPr>
+          <w:p>
+            <w:pPr>
+              <w:spacing w:before="40" w:after="40"/>
+              <w:jc w:val="left"/>
+            </w:pPr>
+            <w:r/>
+            <w:r>
+              <w:rPr>
+                <w:rFonts w:ascii="Times New Roman" w:hAnsi="Times New Roman"/>
+                <w:b w:val="0"/>
+                <w:i w:val="0"/>
+                <w:sz w:val="19"/>
+              </w:rPr>
+              <w:t>Chapters 7 &amp; 9 (Comparative Benchmark, Error Analysis &amp; Real-time Deployment)</w:t>
             </w:r>
           </w:p>
         </w:tc>
@@ -3991,6 +4185,7 @@
           <w:p>
             <w:pPr>
               <w:spacing w:before="40" w:after="40"/>
+              <w:jc w:val="center"/>
             </w:pPr>
             <w:r/>
             <w:r>
@@ -4012,6 +4207,7 @@
           <w:p>
             <w:pPr>
               <w:spacing w:before="40" w:after="40"/>
+              <w:jc w:val="center"/>
             </w:pPr>
             <w:r/>
             <w:r>
@@ -4033,6 +4229,7 @@
           <w:p>
             <w:pPr>
               <w:spacing w:before="40" w:after="40"/>
+              <w:jc w:val="center"/>
             </w:pPr>
             <w:r/>
             <w:r>
@@ -4054,6 +4251,29 @@
           <w:p>
             <w:pPr>
               <w:spacing w:before="40" w:after="40"/>
+              <w:jc w:val="center"/>
+            </w:pPr>
+            <w:r/>
+            <w:r>
+              <w:rPr>
+                <w:rFonts w:ascii="Times New Roman" w:hAnsi="Times New Roman"/>
+                <w:b w:val="0"/>
+                <w:i w:val="0"/>
+                <w:sz w:val="19"/>
+              </w:rPr>
+              <w:t>–</w:t>
+            </w:r>
+          </w:p>
+        </w:tc>
+        <w:tc>
+          <w:tcPr>
+            <w:tcW w:w="642" w:type="dxa"/>
+            <w:vAlign w:val="center"/>
+          </w:tcPr>
+          <w:p>
+            <w:pPr>
+              <w:spacing w:before="40" w:after="40"/>
+              <w:jc w:val="center"/>
             </w:pPr>
             <w:r/>
             <w:r>
@@ -4075,16 +4295,17 @@
           <w:p>
             <w:pPr>
               <w:spacing w:before="40" w:after="40"/>
-            </w:pPr>
-            <w:r/>
-            <w:r>
-              <w:rPr>
-                <w:rFonts w:ascii="Times New Roman" w:hAnsi="Times New Roman"/>
-                <w:b w:val="0"/>
-                <w:i w:val="0"/>
-                <w:sz w:val="19"/>
-              </w:rPr>
-              <w:t>-</w:t>
+              <w:jc w:val="center"/>
+            </w:pPr>
+            <w:r/>
+            <w:r>
+              <w:rPr>
+                <w:rFonts w:ascii="Times New Roman" w:hAnsi="Times New Roman"/>
+                <w:b w:val="0"/>
+                <w:i w:val="0"/>
+                <w:sz w:val="19"/>
+              </w:rPr>
+              <w:t>3</w:t>
             </w:r>
           </w:p>
         </w:tc>
@@ -4096,6 +4317,139 @@
           <w:p>
             <w:pPr>
               <w:spacing w:before="40" w:after="40"/>
+              <w:jc w:val="center"/>
+            </w:pPr>
+            <w:r/>
+            <w:r>
+              <w:rPr>
+                <w:rFonts w:ascii="Times New Roman" w:hAnsi="Times New Roman"/>
+                <w:b w:val="0"/>
+                <w:i w:val="0"/>
+                <w:sz w:val="19"/>
+              </w:rPr>
+              <w:t>–</w:t>
+            </w:r>
+          </w:p>
+        </w:tc>
+        <w:tc>
+          <w:tcPr>
+            <w:tcW w:w="642" w:type="dxa"/>
+            <w:vAlign w:val="center"/>
+          </w:tcPr>
+          <w:p>
+            <w:pPr>
+              <w:spacing w:before="40" w:after="40"/>
+              <w:jc w:val="center"/>
+            </w:pPr>
+            <w:r/>
+            <w:r>
+              <w:rPr>
+                <w:rFonts w:ascii="Times New Roman" w:hAnsi="Times New Roman"/>
+                <w:b w:val="0"/>
+                <w:i w:val="0"/>
+                <w:sz w:val="19"/>
+              </w:rPr>
+              <w:t>–</w:t>
+            </w:r>
+          </w:p>
+        </w:tc>
+        <w:tc>
+          <w:tcPr>
+            <w:tcW w:w="642" w:type="dxa"/>
+            <w:vAlign w:val="center"/>
+          </w:tcPr>
+          <w:p>
+            <w:pPr>
+              <w:spacing w:before="40" w:after="40"/>
+              <w:jc w:val="center"/>
+            </w:pPr>
+            <w:r/>
+            <w:r>
+              <w:rPr>
+                <w:rFonts w:ascii="Times New Roman" w:hAnsi="Times New Roman"/>
+                <w:b w:val="0"/>
+                <w:i w:val="0"/>
+                <w:sz w:val="19"/>
+              </w:rPr>
+              <w:t>–</w:t>
+            </w:r>
+          </w:p>
+        </w:tc>
+        <w:tc>
+          <w:tcPr>
+            <w:tcW w:w="642" w:type="dxa"/>
+            <w:vAlign w:val="center"/>
+          </w:tcPr>
+          <w:p>
+            <w:pPr>
+              <w:spacing w:before="40" w:after="40"/>
+              <w:jc w:val="center"/>
+            </w:pPr>
+            <w:r/>
+            <w:r>
+              <w:rPr>
+                <w:rFonts w:ascii="Times New Roman" w:hAnsi="Times New Roman"/>
+                <w:b w:val="0"/>
+                <w:i w:val="0"/>
+                <w:sz w:val="19"/>
+              </w:rPr>
+              <w:t>–</w:t>
+            </w:r>
+          </w:p>
+        </w:tc>
+        <w:tc>
+          <w:tcPr>
+            <w:tcW w:w="642" w:type="dxa"/>
+            <w:vAlign w:val="center"/>
+          </w:tcPr>
+          <w:p>
+            <w:pPr>
+              <w:spacing w:before="40" w:after="40"/>
+              <w:jc w:val="center"/>
+            </w:pPr>
+            <w:r/>
+            <w:r>
+              <w:rPr>
+                <w:rFonts w:ascii="Times New Roman" w:hAnsi="Times New Roman"/>
+                <w:b w:val="0"/>
+                <w:i w:val="0"/>
+                <w:sz w:val="19"/>
+              </w:rPr>
+              <w:t>–</w:t>
+            </w:r>
+          </w:p>
+        </w:tc>
+        <w:tc>
+          <w:tcPr>
+            <w:tcW w:w="642" w:type="dxa"/>
+            <w:vAlign w:val="center"/>
+          </w:tcPr>
+          <w:p>
+            <w:pPr>
+              <w:spacing w:before="40" w:after="40"/>
+              <w:jc w:val="center"/>
+            </w:pPr>
+            <w:r/>
+            <w:r>
+              <w:rPr>
+                <w:rFonts w:ascii="Times New Roman" w:hAnsi="Times New Roman"/>
+                <w:b w:val="0"/>
+                <w:i w:val="0"/>
+                <w:sz w:val="19"/>
+              </w:rPr>
+              <w:t>2</w:t>
+            </w:r>
+          </w:p>
+        </w:tc>
+        <w:tc>
+          <w:tcPr>
+            <w:tcW w:w="642" w:type="dxa"/>
+            <w:vAlign w:val="center"/>
+          </w:tcPr>
+          <w:p>
+            <w:pPr>
+              <w:spacing w:before="40" w:after="40"/>
+              <w:jc w:val="center"/>
             </w:pPr>
             <w:r/>
             <w:r>
@@ -4117,163 +4471,17 @@
           <w:p>
             <w:pPr>
               <w:spacing w:before="40" w:after="40"/>
-            </w:pPr>
-            <w:r/>
-            <w:r>
-              <w:rPr>
-                <w:rFonts w:ascii="Times New Roman" w:hAnsi="Times New Roman"/>
-                <w:b w:val="0"/>
-                <w:i w:val="0"/>
-                <w:sz w:val="19"/>
-              </w:rPr>
-              <w:t>-</w:t>
-            </w:r>
-          </w:p>
-        </w:tc>
-        <w:tc>
-          <w:tcPr>
-            <w:tcW w:w="642" w:type="dxa"/>
-            <w:vAlign w:val="center"/>
-          </w:tcPr>
-          <w:p>
-            <w:pPr>
-              <w:spacing w:before="40" w:after="40"/>
-            </w:pPr>
-            <w:r/>
-            <w:r>
-              <w:rPr>
-                <w:rFonts w:ascii="Times New Roman" w:hAnsi="Times New Roman"/>
-                <w:b w:val="0"/>
-                <w:i w:val="0"/>
-                <w:sz w:val="19"/>
-              </w:rPr>
-              <w:t>-</w:t>
-            </w:r>
-          </w:p>
-        </w:tc>
-        <w:tc>
-          <w:tcPr>
-            <w:tcW w:w="642" w:type="dxa"/>
-            <w:vAlign w:val="center"/>
-          </w:tcPr>
-          <w:p>
-            <w:pPr>
-              <w:spacing w:before="40" w:after="40"/>
-            </w:pPr>
-            <w:r/>
-            <w:r>
-              <w:rPr>
-                <w:rFonts w:ascii="Times New Roman" w:hAnsi="Times New Roman"/>
-                <w:b w:val="0"/>
-                <w:i w:val="0"/>
-                <w:sz w:val="19"/>
-              </w:rPr>
-              <w:t>-</w:t>
-            </w:r>
-          </w:p>
-        </w:tc>
-        <w:tc>
-          <w:tcPr>
-            <w:tcW w:w="642" w:type="dxa"/>
-            <w:vAlign w:val="center"/>
-          </w:tcPr>
-          <w:p>
-            <w:pPr>
-              <w:spacing w:before="40" w:after="40"/>
-            </w:pPr>
-            <w:r/>
-            <w:r>
-              <w:rPr>
-                <w:rFonts w:ascii="Times New Roman" w:hAnsi="Times New Roman"/>
-                <w:b w:val="0"/>
-                <w:i w:val="0"/>
-                <w:sz w:val="19"/>
-              </w:rPr>
-              <w:t>-</w:t>
-            </w:r>
-          </w:p>
-        </w:tc>
-        <w:tc>
-          <w:tcPr>
-            <w:tcW w:w="642" w:type="dxa"/>
-            <w:vAlign w:val="center"/>
-          </w:tcPr>
-          <w:p>
-            <w:pPr>
-              <w:spacing w:before="40" w:after="40"/>
-            </w:pPr>
-            <w:r/>
-            <w:r>
-              <w:rPr>
-                <w:rFonts w:ascii="Times New Roman" w:hAnsi="Times New Roman"/>
-                <w:b w:val="0"/>
-                <w:i w:val="0"/>
-                <w:sz w:val="19"/>
-              </w:rPr>
-              <w:t>-</w:t>
-            </w:r>
-          </w:p>
-        </w:tc>
-        <w:tc>
-          <w:tcPr>
-            <w:tcW w:w="642" w:type="dxa"/>
-            <w:vAlign w:val="center"/>
-          </w:tcPr>
-          <w:p>
-            <w:pPr>
-              <w:spacing w:before="40" w:after="40"/>
-            </w:pPr>
-            <w:r/>
-            <w:r>
-              <w:rPr>
-                <w:rFonts w:ascii="Times New Roman" w:hAnsi="Times New Roman"/>
-                <w:b w:val="0"/>
-                <w:i w:val="0"/>
-                <w:sz w:val="19"/>
-              </w:rPr>
-              <w:t>-</w:t>
-            </w:r>
-          </w:p>
-        </w:tc>
-        <w:tc>
-          <w:tcPr>
-            <w:tcW w:w="642" w:type="dxa"/>
-            <w:vAlign w:val="center"/>
-          </w:tcPr>
-          <w:p>
-            <w:pPr>
-              <w:spacing w:before="40" w:after="40"/>
-            </w:pPr>
-            <w:r/>
-            <w:r>
-              <w:rPr>
-                <w:rFonts w:ascii="Times New Roman" w:hAnsi="Times New Roman"/>
-                <w:b w:val="0"/>
-                <w:i w:val="0"/>
-                <w:sz w:val="19"/>
-              </w:rPr>
-              <w:t>3</w:t>
-            </w:r>
-          </w:p>
-        </w:tc>
-        <w:tc>
-          <w:tcPr>
-            <w:tcW w:w="642" w:type="dxa"/>
-            <w:vAlign w:val="center"/>
-          </w:tcPr>
-          <w:p>
-            <w:pPr>
-              <w:spacing w:before="40" w:after="40"/>
-            </w:pPr>
-            <w:r/>
-            <w:r>
-              <w:rPr>
-                <w:rFonts w:ascii="Times New Roman" w:hAnsi="Times New Roman"/>
-                <w:b w:val="0"/>
-                <w:i w:val="0"/>
-                <w:sz w:val="19"/>
-              </w:rPr>
-              <w:t>2</w:t>
+              <w:jc w:val="center"/>
+            </w:pPr>
+            <w:r/>
+            <w:r>
+              <w:rPr>
+                <w:rFonts w:ascii="Times New Roman" w:hAnsi="Times New Roman"/>
+                <w:b w:val="0"/>
+                <w:i w:val="0"/>
+                <w:sz w:val="19"/>
+              </w:rPr>
+              <w:t>–</w:t>
             </w:r>
           </w:p>
         </w:tc>
@@ -4292,6 +4500,7 @@
           <w:p>
             <w:pPr>
               <w:spacing w:before="40" w:after="40"/>
+              <w:jc w:val="center"/>
             </w:pPr>
             <w:r/>
             <w:r>
@@ -4313,6 +4522,7 @@
           <w:p>
             <w:pPr>
               <w:spacing w:before="40" w:after="40"/>
+              <w:jc w:val="center"/>
             </w:pPr>
             <w:r/>
             <w:r>
@@ -4334,6 +4544,7 @@
           <w:p>
             <w:pPr>
               <w:spacing w:before="40" w:after="40"/>
+              <w:jc w:val="center"/>
             </w:pPr>
             <w:r/>
             <w:r>
@@ -4355,6 +4566,51 @@
           <w:p>
             <w:pPr>
               <w:spacing w:before="40" w:after="40"/>
+              <w:jc w:val="center"/>
+            </w:pPr>
+            <w:r/>
+            <w:r>
+              <w:rPr>
+                <w:rFonts w:ascii="Times New Roman" w:hAnsi="Times New Roman"/>
+                <w:b w:val="0"/>
+                <w:i w:val="0"/>
+                <w:sz w:val="19"/>
+              </w:rPr>
+              <w:t>2</w:t>
+            </w:r>
+          </w:p>
+        </w:tc>
+        <w:tc>
+          <w:tcPr>
+            <w:tcW w:w="642" w:type="dxa"/>
+            <w:vAlign w:val="center"/>
+          </w:tcPr>
+          <w:p>
+            <w:pPr>
+              <w:spacing w:before="40" w:after="40"/>
+              <w:jc w:val="center"/>
+            </w:pPr>
+            <w:r/>
+            <w:r>
+              <w:rPr>
+                <w:rFonts w:ascii="Times New Roman" w:hAnsi="Times New Roman"/>
+                <w:b w:val="0"/>
+                <w:i w:val="0"/>
+                <w:sz w:val="19"/>
+              </w:rPr>
+              <w:t>2</w:t>
+            </w:r>
+          </w:p>
+        </w:tc>
+        <w:tc>
+          <w:tcPr>
+            <w:tcW w:w="642" w:type="dxa"/>
+            <w:vAlign w:val="center"/>
+          </w:tcPr>
+          <w:p>
+            <w:pPr>
+              <w:spacing w:before="40" w:after="40"/>
+              <w:jc w:val="center"/>
             </w:pPr>
             <w:r/>
             <w:r>
@@ -4376,16 +4632,17 @@
           <w:p>
             <w:pPr>
               <w:spacing w:before="40" w:after="40"/>
-            </w:pPr>
-            <w:r/>
-            <w:r>
-              <w:rPr>
-                <w:rFonts w:ascii="Times New Roman" w:hAnsi="Times New Roman"/>
-                <w:b w:val="0"/>
-                <w:i w:val="0"/>
-                <w:sz w:val="19"/>
-              </w:rPr>
-              <w:t>-</w:t>
+              <w:jc w:val="center"/>
+            </w:pPr>
+            <w:r/>
+            <w:r>
+              <w:rPr>
+                <w:rFonts w:ascii="Times New Roman" w:hAnsi="Times New Roman"/>
+                <w:b w:val="0"/>
+                <w:i w:val="0"/>
+                <w:sz w:val="19"/>
+              </w:rPr>
+              <w:t>–</w:t>
             </w:r>
           </w:p>
         </w:tc>
@@ -4397,6 +4654,117 @@
           <w:p>
             <w:pPr>
               <w:spacing w:before="40" w:after="40"/>
+              <w:jc w:val="center"/>
+            </w:pPr>
+            <w:r/>
+            <w:r>
+              <w:rPr>
+                <w:rFonts w:ascii="Times New Roman" w:hAnsi="Times New Roman"/>
+                <w:b w:val="0"/>
+                <w:i w:val="0"/>
+                <w:sz w:val="19"/>
+              </w:rPr>
+              <w:t>–</w:t>
+            </w:r>
+          </w:p>
+        </w:tc>
+        <w:tc>
+          <w:tcPr>
+            <w:tcW w:w="642" w:type="dxa"/>
+            <w:vAlign w:val="center"/>
+          </w:tcPr>
+          <w:p>
+            <w:pPr>
+              <w:spacing w:before="40" w:after="40"/>
+              <w:jc w:val="center"/>
+            </w:pPr>
+            <w:r/>
+            <w:r>
+              <w:rPr>
+                <w:rFonts w:ascii="Times New Roman" w:hAnsi="Times New Roman"/>
+                <w:b w:val="0"/>
+                <w:i w:val="0"/>
+                <w:sz w:val="19"/>
+              </w:rPr>
+              <w:t>–</w:t>
+            </w:r>
+          </w:p>
+        </w:tc>
+        <w:tc>
+          <w:tcPr>
+            <w:tcW w:w="642" w:type="dxa"/>
+            <w:vAlign w:val="center"/>
+          </w:tcPr>
+          <w:p>
+            <w:pPr>
+              <w:spacing w:before="40" w:after="40"/>
+              <w:jc w:val="center"/>
+            </w:pPr>
+            <w:r/>
+            <w:r>
+              <w:rPr>
+                <w:rFonts w:ascii="Times New Roman" w:hAnsi="Times New Roman"/>
+                <w:b w:val="0"/>
+                <w:i w:val="0"/>
+                <w:sz w:val="19"/>
+              </w:rPr>
+              <w:t>2</w:t>
+            </w:r>
+          </w:p>
+        </w:tc>
+        <w:tc>
+          <w:tcPr>
+            <w:tcW w:w="642" w:type="dxa"/>
+            <w:vAlign w:val="center"/>
+          </w:tcPr>
+          <w:p>
+            <w:pPr>
+              <w:spacing w:before="40" w:after="40"/>
+              <w:jc w:val="center"/>
+            </w:pPr>
+            <w:r/>
+            <w:r>
+              <w:rPr>
+                <w:rFonts w:ascii="Times New Roman" w:hAnsi="Times New Roman"/>
+                <w:b w:val="0"/>
+                <w:i w:val="0"/>
+                <w:sz w:val="19"/>
+              </w:rPr>
+              <w:t>–</w:t>
+            </w:r>
+          </w:p>
+        </w:tc>
+        <w:tc>
+          <w:tcPr>
+            <w:tcW w:w="642" w:type="dxa"/>
+            <w:vAlign w:val="center"/>
+          </w:tcPr>
+          <w:p>
+            <w:pPr>
+              <w:spacing w:before="40" w:after="40"/>
+              <w:jc w:val="center"/>
+            </w:pPr>
+            <w:r/>
+            <w:r>
+              <w:rPr>
+                <w:rFonts w:ascii="Times New Roman" w:hAnsi="Times New Roman"/>
+                <w:b w:val="0"/>
+                <w:i w:val="0"/>
+                <w:sz w:val="19"/>
+              </w:rPr>
+              <w:t>2</w:t>
+            </w:r>
+          </w:p>
+        </w:tc>
+        <w:tc>
+          <w:tcPr>
+            <w:tcW w:w="642" w:type="dxa"/>
+            <w:vAlign w:val="center"/>
+          </w:tcPr>
+          <w:p>
+            <w:pPr>
+              <w:spacing w:before="40" w:after="40"/>
+              <w:jc w:val="center"/>
             </w:pPr>
             <w:r/>
             <w:r>
@@ -4418,163 +4786,17 @@
           <w:p>
             <w:pPr>
               <w:spacing w:before="40" w:after="40"/>
-            </w:pPr>
-            <w:r/>
-            <w:r>
-              <w:rPr>
-                <w:rFonts w:ascii="Times New Roman" w:hAnsi="Times New Roman"/>
-                <w:b w:val="0"/>
-                <w:i w:val="0"/>
-                <w:sz w:val="19"/>
-              </w:rPr>
-              <w:t>-</w:t>
-            </w:r>
-          </w:p>
-        </w:tc>
-        <w:tc>
-          <w:tcPr>
-            <w:tcW w:w="642" w:type="dxa"/>
-            <w:vAlign w:val="center"/>
-          </w:tcPr>
-          <w:p>
-            <w:pPr>
-              <w:spacing w:before="40" w:after="40"/>
-            </w:pPr>
-            <w:r/>
-            <w:r>
-              <w:rPr>
-                <w:rFonts w:ascii="Times New Roman" w:hAnsi="Times New Roman"/>
-                <w:b w:val="0"/>
-                <w:i w:val="0"/>
-                <w:sz w:val="19"/>
-              </w:rPr>
-              <w:t>-</w:t>
-            </w:r>
-          </w:p>
-        </w:tc>
-        <w:tc>
-          <w:tcPr>
-            <w:tcW w:w="642" w:type="dxa"/>
-            <w:vAlign w:val="center"/>
-          </w:tcPr>
-          <w:p>
-            <w:pPr>
-              <w:spacing w:before="40" w:after="40"/>
-            </w:pPr>
-            <w:r/>
-            <w:r>
-              <w:rPr>
-                <w:rFonts w:ascii="Times New Roman" w:hAnsi="Times New Roman"/>
-                <w:b w:val="0"/>
-                <w:i w:val="0"/>
-                <w:sz w:val="19"/>
-              </w:rPr>
-              <w:t>-</w:t>
-            </w:r>
-          </w:p>
-        </w:tc>
-        <w:tc>
-          <w:tcPr>
-            <w:tcW w:w="642" w:type="dxa"/>
-            <w:vAlign w:val="center"/>
-          </w:tcPr>
-          <w:p>
-            <w:pPr>
-              <w:spacing w:before="40" w:after="40"/>
-            </w:pPr>
-            <w:r/>
-            <w:r>
-              <w:rPr>
-                <w:rFonts w:ascii="Times New Roman" w:hAnsi="Times New Roman"/>
-                <w:b w:val="0"/>
-                <w:i w:val="0"/>
-                <w:sz w:val="19"/>
-              </w:rPr>
-              <w:t>-</w:t>
-            </w:r>
-          </w:p>
-        </w:tc>
-        <w:tc>
-          <w:tcPr>
-            <w:tcW w:w="642" w:type="dxa"/>
-            <w:vAlign w:val="center"/>
-          </w:tcPr>
-          <w:p>
-            <w:pPr>
-              <w:spacing w:before="40" w:after="40"/>
-            </w:pPr>
-            <w:r/>
-            <w:r>
-              <w:rPr>
-                <w:rFonts w:ascii="Times New Roman" w:hAnsi="Times New Roman"/>
-                <w:b w:val="0"/>
-                <w:i w:val="0"/>
-                <w:sz w:val="19"/>
-              </w:rPr>
-              <w:t>-</w:t>
-            </w:r>
-          </w:p>
-        </w:tc>
-        <w:tc>
-          <w:tcPr>
-            <w:tcW w:w="642" w:type="dxa"/>
-            <w:vAlign w:val="center"/>
-          </w:tcPr>
-          <w:p>
-            <w:pPr>
-              <w:spacing w:before="40" w:after="40"/>
-            </w:pPr>
-            <w:r/>
-            <w:r>
-              <w:rPr>
-                <w:rFonts w:ascii="Times New Roman" w:hAnsi="Times New Roman"/>
-                <w:b w:val="0"/>
-                <w:i w:val="0"/>
-                <w:sz w:val="19"/>
-              </w:rPr>
-              <w:t>-</w:t>
-            </w:r>
-          </w:p>
-        </w:tc>
-        <w:tc>
-          <w:tcPr>
-            <w:tcW w:w="642" w:type="dxa"/>
-            <w:vAlign w:val="center"/>
-          </w:tcPr>
-          <w:p>
-            <w:pPr>
-              <w:spacing w:before="40" w:after="40"/>
-            </w:pPr>
-            <w:r/>
-            <w:r>
-              <w:rPr>
-                <w:rFonts w:ascii="Times New Roman" w:hAnsi="Times New Roman"/>
-                <w:b w:val="0"/>
-                <w:i w:val="0"/>
-                <w:sz w:val="19"/>
-              </w:rPr>
-              <w:t>3</w:t>
-            </w:r>
-          </w:p>
-        </w:tc>
-        <w:tc>
-          <w:tcPr>
-            <w:tcW w:w="642" w:type="dxa"/>
-            <w:vAlign w:val="center"/>
-          </w:tcPr>
-          <w:p>
-            <w:pPr>
-              <w:spacing w:before="40" w:after="40"/>
-            </w:pPr>
-            <w:r/>
-            <w:r>
-              <w:rPr>
-                <w:rFonts w:ascii="Times New Roman" w:hAnsi="Times New Roman"/>
-                <w:b w:val="0"/>
-                <w:i w:val="0"/>
-                <w:sz w:val="19"/>
-              </w:rPr>
-              <w:t>3</w:t>
+              <w:jc w:val="center"/>
+            </w:pPr>
+            <w:r/>
+            <w:r>
+              <w:rPr>
+                <w:rFonts w:ascii="Times New Roman" w:hAnsi="Times New Roman"/>
+                <w:b w:val="0"/>
+                <w:i w:val="0"/>
+                <w:sz w:val="19"/>
+              </w:rPr>
+              <w:t>2</w:t>
             </w:r>
           </w:p>
         </w:tc>
@@ -4593,6 +4815,7 @@
           <w:p>
             <w:pPr>
               <w:spacing w:before="40" w:after="40"/>
+              <w:jc w:val="center"/>
             </w:pPr>
             <w:r/>
             <w:r>
@@ -4614,6 +4837,7 @@
           <w:p>
             <w:pPr>
               <w:spacing w:before="40" w:after="40"/>
+              <w:jc w:val="center"/>
             </w:pPr>
             <w:r/>
             <w:r>
@@ -4635,6 +4859,7 @@
           <w:p>
             <w:pPr>
               <w:spacing w:before="40" w:after="40"/>
+              <w:jc w:val="center"/>
             </w:pPr>
             <w:r/>
             <w:r>
@@ -4656,16 +4881,17 @@
           <w:p>
             <w:pPr>
               <w:spacing w:before="40" w:after="40"/>
-            </w:pPr>
-            <w:r/>
-            <w:r>
-              <w:rPr>
-                <w:rFonts w:ascii="Times New Roman" w:hAnsi="Times New Roman"/>
-                <w:b w:val="0"/>
-                <w:i w:val="0"/>
-                <w:sz w:val="19"/>
-              </w:rPr>
-              <w:t>-</w:t>
+              <w:jc w:val="center"/>
+            </w:pPr>
+            <w:r/>
+            <w:r>
+              <w:rPr>
+                <w:rFonts w:ascii="Times New Roman" w:hAnsi="Times New Roman"/>
+                <w:b w:val="0"/>
+                <w:i w:val="0"/>
+                <w:sz w:val="19"/>
+              </w:rPr>
+              <w:t>3</w:t>
             </w:r>
           </w:p>
         </w:tc>
@@ -4677,6 +4903,29 @@
           <w:p>
             <w:pPr>
               <w:spacing w:before="40" w:after="40"/>
+              <w:jc w:val="center"/>
+            </w:pPr>
+            <w:r/>
+            <w:r>
+              <w:rPr>
+                <w:rFonts w:ascii="Times New Roman" w:hAnsi="Times New Roman"/>
+                <w:b w:val="0"/>
+                <w:i w:val="0"/>
+                <w:sz w:val="19"/>
+              </w:rPr>
+              <w:t>2</w:t>
+            </w:r>
+          </w:p>
+        </w:tc>
+        <w:tc>
+          <w:tcPr>
+            <w:tcW w:w="642" w:type="dxa"/>
+            <w:vAlign w:val="center"/>
+          </w:tcPr>
+          <w:p>
+            <w:pPr>
+              <w:spacing w:before="40" w:after="40"/>
+              <w:jc w:val="center"/>
             </w:pPr>
             <w:r/>
             <w:r>
@@ -4698,6 +4947,139 @@
           <w:p>
             <w:pPr>
               <w:spacing w:before="40" w:after="40"/>
+              <w:jc w:val="center"/>
+            </w:pPr>
+            <w:r/>
+            <w:r>
+              <w:rPr>
+                <w:rFonts w:ascii="Times New Roman" w:hAnsi="Times New Roman"/>
+                <w:b w:val="0"/>
+                <w:i w:val="0"/>
+                <w:sz w:val="19"/>
+              </w:rPr>
+              <w:t>–</w:t>
+            </w:r>
+          </w:p>
+        </w:tc>
+        <w:tc>
+          <w:tcPr>
+            <w:tcW w:w="642" w:type="dxa"/>
+            <w:vAlign w:val="center"/>
+          </w:tcPr>
+          <w:p>
+            <w:pPr>
+              <w:spacing w:before="40" w:after="40"/>
+              <w:jc w:val="center"/>
+            </w:pPr>
+            <w:r/>
+            <w:r>
+              <w:rPr>
+                <w:rFonts w:ascii="Times New Roman" w:hAnsi="Times New Roman"/>
+                <w:b w:val="0"/>
+                <w:i w:val="0"/>
+                <w:sz w:val="19"/>
+              </w:rPr>
+              <w:t>–</w:t>
+            </w:r>
+          </w:p>
+        </w:tc>
+        <w:tc>
+          <w:tcPr>
+            <w:tcW w:w="642" w:type="dxa"/>
+            <w:vAlign w:val="center"/>
+          </w:tcPr>
+          <w:p>
+            <w:pPr>
+              <w:spacing w:before="40" w:after="40"/>
+              <w:jc w:val="center"/>
+            </w:pPr>
+            <w:r/>
+            <w:r>
+              <w:rPr>
+                <w:rFonts w:ascii="Times New Roman" w:hAnsi="Times New Roman"/>
+                <w:b w:val="0"/>
+                <w:i w:val="0"/>
+                <w:sz w:val="19"/>
+              </w:rPr>
+              <w:t>–</w:t>
+            </w:r>
+          </w:p>
+        </w:tc>
+        <w:tc>
+          <w:tcPr>
+            <w:tcW w:w="642" w:type="dxa"/>
+            <w:vAlign w:val="center"/>
+          </w:tcPr>
+          <w:p>
+            <w:pPr>
+              <w:spacing w:before="40" w:after="40"/>
+              <w:jc w:val="center"/>
+            </w:pPr>
+            <w:r/>
+            <w:r>
+              <w:rPr>
+                <w:rFonts w:ascii="Times New Roman" w:hAnsi="Times New Roman"/>
+                <w:b w:val="0"/>
+                <w:i w:val="0"/>
+                <w:sz w:val="19"/>
+              </w:rPr>
+              <w:t>–</w:t>
+            </w:r>
+          </w:p>
+        </w:tc>
+        <w:tc>
+          <w:tcPr>
+            <w:tcW w:w="642" w:type="dxa"/>
+            <w:vAlign w:val="center"/>
+          </w:tcPr>
+          <w:p>
+            <w:pPr>
+              <w:spacing w:before="40" w:after="40"/>
+              <w:jc w:val="center"/>
+            </w:pPr>
+            <w:r/>
+            <w:r>
+              <w:rPr>
+                <w:rFonts w:ascii="Times New Roman" w:hAnsi="Times New Roman"/>
+                <w:b w:val="0"/>
+                <w:i w:val="0"/>
+                <w:sz w:val="19"/>
+              </w:rPr>
+              <w:t>–</w:t>
+            </w:r>
+          </w:p>
+        </w:tc>
+        <w:tc>
+          <w:tcPr>
+            <w:tcW w:w="642" w:type="dxa"/>
+            <w:vAlign w:val="center"/>
+          </w:tcPr>
+          <w:p>
+            <w:pPr>
+              <w:spacing w:before="40" w:after="40"/>
+              <w:jc w:val="center"/>
+            </w:pPr>
+            <w:r/>
+            <w:r>
+              <w:rPr>
+                <w:rFonts w:ascii="Times New Roman" w:hAnsi="Times New Roman"/>
+                <w:b w:val="0"/>
+                <w:i w:val="0"/>
+                <w:sz w:val="19"/>
+              </w:rPr>
+              <w:t>2</w:t>
+            </w:r>
+          </w:p>
+        </w:tc>
+        <w:tc>
+          <w:tcPr>
+            <w:tcW w:w="642" w:type="dxa"/>
+            <w:vAlign w:val="center"/>
+          </w:tcPr>
+          <w:p>
+            <w:pPr>
+              <w:spacing w:before="40" w:after="40"/>
+              <w:jc w:val="center"/>
             </w:pPr>
             <w:r/>
             <w:r>
@@ -4719,132 +5101,7 @@
           <w:p>
             <w:pPr>
               <w:spacing w:before="40" w:after="40"/>
-            </w:pPr>
-            <w:r/>
-            <w:r>
-              <w:rPr>
-                <w:rFonts w:ascii="Times New Roman" w:hAnsi="Times New Roman"/>
-                <w:b w:val="0"/>
-                <w:i w:val="0"/>
-                <w:sz w:val="19"/>
-              </w:rPr>
-              <w:t>-</w:t>
-            </w:r>
-          </w:p>
-        </w:tc>
-        <w:tc>
-          <w:tcPr>
-            <w:tcW w:w="642" w:type="dxa"/>
-            <w:vAlign w:val="center"/>
-          </w:tcPr>
-          <w:p>
-            <w:pPr>
-              <w:spacing w:before="40" w:after="40"/>
-            </w:pPr>
-            <w:r/>
-            <w:r>
-              <w:rPr>
-                <w:rFonts w:ascii="Times New Roman" w:hAnsi="Times New Roman"/>
-                <w:b w:val="0"/>
-                <w:i w:val="0"/>
-                <w:sz w:val="19"/>
-              </w:rPr>
-              <w:t>-</w:t>
-            </w:r>
-          </w:p>
-        </w:tc>
-        <w:tc>
-          <w:tcPr>
-            <w:tcW w:w="642" w:type="dxa"/>
-            <w:vAlign w:val="center"/>
-          </w:tcPr>
-          <w:p>
-            <w:pPr>
-              <w:spacing w:before="40" w:after="40"/>
-            </w:pPr>
-            <w:r/>
-            <w:r>
-              <w:rPr>
-                <w:rFonts w:ascii="Times New Roman" w:hAnsi="Times New Roman"/>
-                <w:b w:val="0"/>
-                <w:i w:val="0"/>
-                <w:sz w:val="19"/>
-              </w:rPr>
-              <w:t>-</w:t>
-            </w:r>
-          </w:p>
-        </w:tc>
-        <w:tc>
-          <w:tcPr>
-            <w:tcW w:w="642" w:type="dxa"/>
-            <w:vAlign w:val="center"/>
-          </w:tcPr>
-          <w:p>
-            <w:pPr>
-              <w:spacing w:before="40" w:after="40"/>
-            </w:pPr>
-            <w:r/>
-            <w:r>
-              <w:rPr>
-                <w:rFonts w:ascii="Times New Roman" w:hAnsi="Times New Roman"/>
-                <w:b w:val="0"/>
-                <w:i w:val="0"/>
-                <w:sz w:val="19"/>
-              </w:rPr>
-              <w:t>-</w:t>
-            </w:r>
-          </w:p>
-        </w:tc>
-        <w:tc>
-          <w:tcPr>
-            <w:tcW w:w="642" w:type="dxa"/>
-            <w:vAlign w:val="center"/>
-          </w:tcPr>
-          <w:p>
-            <w:pPr>
-              <w:spacing w:before="40" w:after="40"/>
-            </w:pPr>
-            <w:r/>
-            <w:r>
-              <w:rPr>
-                <w:rFonts w:ascii="Times New Roman" w:hAnsi="Times New Roman"/>
-                <w:b w:val="0"/>
-                <w:i w:val="0"/>
-                <w:sz w:val="19"/>
-              </w:rPr>
-              <w:t>-</w:t>
-            </w:r>
-          </w:p>
-        </w:tc>
-        <w:tc>
-          <w:tcPr>
-            <w:tcW w:w="642" w:type="dxa"/>
-            <w:vAlign w:val="center"/>
-          </w:tcPr>
-          <w:p>
-            <w:pPr>
-              <w:spacing w:before="40" w:after="40"/>
-            </w:pPr>
-            <w:r/>
-            <w:r>
-              <w:rPr>
-                <w:rFonts w:ascii="Times New Roman" w:hAnsi="Times New Roman"/>
-                <w:b w:val="0"/>
-                <w:i w:val="0"/>
-                <w:sz w:val="19"/>
-              </w:rPr>
-              <w:t>-</w:t>
-            </w:r>
-          </w:p>
-        </w:tc>
-        <w:tc>
-          <w:tcPr>
-            <w:tcW w:w="642" w:type="dxa"/>
-            <w:vAlign w:val="center"/>
-          </w:tcPr>
-          <w:p>
-            <w:pPr>
-              <w:spacing w:before="40" w:after="40"/>
+              <w:jc w:val="center"/>
             </w:pPr>
             <w:r/>
             <w:r>
@@ -4855,27 +5112,6 @@
                 <w:sz w:val="19"/>
               </w:rPr>
               <w:t>3</w:t>
-            </w:r>
-          </w:p>
-        </w:tc>
-        <w:tc>
-          <w:tcPr>
-            <w:tcW w:w="642" w:type="dxa"/>
-            <w:vAlign w:val="center"/>
-          </w:tcPr>
-          <w:p>
-            <w:pPr>
-              <w:spacing w:before="40" w:after="40"/>
-            </w:pPr>
-            <w:r/>
-            <w:r>
-              <w:rPr>
-                <w:rFonts w:ascii="Times New Roman" w:hAnsi="Times New Roman"/>
-                <w:b w:val="0"/>
-                <w:i w:val="0"/>
-                <w:sz w:val="19"/>
-              </w:rPr>
-              <w:t>2</w:t>
             </w:r>
           </w:p>
         </w:tc>
@@ -4894,6 +5130,7 @@
           <w:p>
             <w:pPr>
               <w:spacing w:before="40" w:after="40"/>
+              <w:jc w:val="center"/>
             </w:pPr>
             <w:r/>
             <w:r>
@@ -4915,16 +5152,17 @@
           <w:p>
             <w:pPr>
               <w:spacing w:before="40" w:after="40"/>
-            </w:pPr>
-            <w:r/>
-            <w:r>
-              <w:rPr>
-                <w:rFonts w:ascii="Times New Roman" w:hAnsi="Times New Roman"/>
-                <w:b w:val="0"/>
-                <w:i w:val="0"/>
-                <w:sz w:val="19"/>
-              </w:rPr>
-              <w:t>-</w:t>
+              <w:jc w:val="center"/>
+            </w:pPr>
+            <w:r/>
+            <w:r>
+              <w:rPr>
+                <w:rFonts w:ascii="Times New Roman" w:hAnsi="Times New Roman"/>
+                <w:b w:val="0"/>
+                <w:i w:val="0"/>
+                <w:sz w:val="19"/>
+              </w:rPr>
+              <w:t>3</w:t>
             </w:r>
           </w:p>
         </w:tc>
@@ -4936,16 +5174,17 @@
           <w:p>
             <w:pPr>
               <w:spacing w:before="40" w:after="40"/>
-            </w:pPr>
-            <w:r/>
-            <w:r>
-              <w:rPr>
-                <w:rFonts w:ascii="Times New Roman" w:hAnsi="Times New Roman"/>
-                <w:b w:val="0"/>
-                <w:i w:val="0"/>
-                <w:sz w:val="19"/>
-              </w:rPr>
-              <w:t>-</w:t>
+              <w:jc w:val="center"/>
+            </w:pPr>
+            <w:r/>
+            <w:r>
+              <w:rPr>
+                <w:rFonts w:ascii="Times New Roman" w:hAnsi="Times New Roman"/>
+                <w:b w:val="0"/>
+                <w:i w:val="0"/>
+                <w:sz w:val="19"/>
+              </w:rPr>
+              <w:t>3</w:t>
             </w:r>
           </w:p>
         </w:tc>
@@ -4957,16 +5196,17 @@
           <w:p>
             <w:pPr>
               <w:spacing w:before="40" w:after="40"/>
-            </w:pPr>
-            <w:r/>
-            <w:r>
-              <w:rPr>
-                <w:rFonts w:ascii="Times New Roman" w:hAnsi="Times New Roman"/>
-                <w:b w:val="0"/>
-                <w:i w:val="0"/>
-                <w:sz w:val="19"/>
-              </w:rPr>
-              <w:t>-</w:t>
+              <w:jc w:val="center"/>
+            </w:pPr>
+            <w:r/>
+            <w:r>
+              <w:rPr>
+                <w:rFonts w:ascii="Times New Roman" w:hAnsi="Times New Roman"/>
+                <w:b w:val="0"/>
+                <w:i w:val="0"/>
+                <w:sz w:val="19"/>
+              </w:rPr>
+              <w:t>3</w:t>
             </w:r>
           </w:p>
         </w:tc>
@@ -4978,16 +5218,17 @@
           <w:p>
             <w:pPr>
               <w:spacing w:before="40" w:after="40"/>
-            </w:pPr>
-            <w:r/>
-            <w:r>
-              <w:rPr>
-                <w:rFonts w:ascii="Times New Roman" w:hAnsi="Times New Roman"/>
-                <w:b w:val="0"/>
-                <w:i w:val="0"/>
-                <w:sz w:val="19"/>
-              </w:rPr>
-              <w:t>-</w:t>
+              <w:jc w:val="center"/>
+            </w:pPr>
+            <w:r/>
+            <w:r>
+              <w:rPr>
+                <w:rFonts w:ascii="Times New Roman" w:hAnsi="Times New Roman"/>
+                <w:b w:val="0"/>
+                <w:i w:val="0"/>
+                <w:sz w:val="19"/>
+              </w:rPr>
+              <w:t>3</w:t>
             </w:r>
           </w:p>
         </w:tc>
@@ -4999,6 +5240,139 @@
           <w:p>
             <w:pPr>
               <w:spacing w:before="40" w:after="40"/>
+              <w:jc w:val="center"/>
+            </w:pPr>
+            <w:r/>
+            <w:r>
+              <w:rPr>
+                <w:rFonts w:ascii="Times New Roman" w:hAnsi="Times New Roman"/>
+                <w:b w:val="0"/>
+                <w:i w:val="0"/>
+                <w:sz w:val="19"/>
+              </w:rPr>
+              <w:t>3</w:t>
+            </w:r>
+          </w:p>
+        </w:tc>
+        <w:tc>
+          <w:tcPr>
+            <w:tcW w:w="642" w:type="dxa"/>
+            <w:vAlign w:val="center"/>
+          </w:tcPr>
+          <w:p>
+            <w:pPr>
+              <w:spacing w:before="40" w:after="40"/>
+              <w:jc w:val="center"/>
+            </w:pPr>
+            <w:r/>
+            <w:r>
+              <w:rPr>
+                <w:rFonts w:ascii="Times New Roman" w:hAnsi="Times New Roman"/>
+                <w:b w:val="0"/>
+                <w:i w:val="0"/>
+                <w:sz w:val="19"/>
+              </w:rPr>
+              <w:t>–</w:t>
+            </w:r>
+          </w:p>
+        </w:tc>
+        <w:tc>
+          <w:tcPr>
+            <w:tcW w:w="642" w:type="dxa"/>
+            <w:vAlign w:val="center"/>
+          </w:tcPr>
+          <w:p>
+            <w:pPr>
+              <w:spacing w:before="40" w:after="40"/>
+              <w:jc w:val="center"/>
+            </w:pPr>
+            <w:r/>
+            <w:r>
+              <w:rPr>
+                <w:rFonts w:ascii="Times New Roman" w:hAnsi="Times New Roman"/>
+                <w:b w:val="0"/>
+                <w:i w:val="0"/>
+                <w:sz w:val="19"/>
+              </w:rPr>
+              <w:t>–</w:t>
+            </w:r>
+          </w:p>
+        </w:tc>
+        <w:tc>
+          <w:tcPr>
+            <w:tcW w:w="642" w:type="dxa"/>
+            <w:vAlign w:val="center"/>
+          </w:tcPr>
+          <w:p>
+            <w:pPr>
+              <w:spacing w:before="40" w:after="40"/>
+              <w:jc w:val="center"/>
+            </w:pPr>
+            <w:r/>
+            <w:r>
+              <w:rPr>
+                <w:rFonts w:ascii="Times New Roman" w:hAnsi="Times New Roman"/>
+                <w:b w:val="0"/>
+                <w:i w:val="0"/>
+                <w:sz w:val="19"/>
+              </w:rPr>
+              <w:t>–</w:t>
+            </w:r>
+          </w:p>
+        </w:tc>
+        <w:tc>
+          <w:tcPr>
+            <w:tcW w:w="642" w:type="dxa"/>
+            <w:vAlign w:val="center"/>
+          </w:tcPr>
+          <w:p>
+            <w:pPr>
+              <w:spacing w:before="40" w:after="40"/>
+              <w:jc w:val="center"/>
+            </w:pPr>
+            <w:r/>
+            <w:r>
+              <w:rPr>
+                <w:rFonts w:ascii="Times New Roman" w:hAnsi="Times New Roman"/>
+                <w:b w:val="0"/>
+                <w:i w:val="0"/>
+                <w:sz w:val="19"/>
+              </w:rPr>
+              <w:t>–</w:t>
+            </w:r>
+          </w:p>
+        </w:tc>
+        <w:tc>
+          <w:tcPr>
+            <w:tcW w:w="642" w:type="dxa"/>
+            <w:vAlign w:val="center"/>
+          </w:tcPr>
+          <w:p>
+            <w:pPr>
+              <w:spacing w:before="40" w:after="40"/>
+              <w:jc w:val="center"/>
+            </w:pPr>
+            <w:r/>
+            <w:r>
+              <w:rPr>
+                <w:rFonts w:ascii="Times New Roman" w:hAnsi="Times New Roman"/>
+                <w:b w:val="0"/>
+                <w:i w:val="0"/>
+                <w:sz w:val="19"/>
+              </w:rPr>
+              <w:t>–</w:t>
+            </w:r>
+          </w:p>
+        </w:tc>
+        <w:tc>
+          <w:tcPr>
+            <w:tcW w:w="642" w:type="dxa"/>
+            <w:vAlign w:val="center"/>
+          </w:tcPr>
+          <w:p>
+            <w:pPr>
+              <w:spacing w:before="40" w:after="40"/>
+              <w:jc w:val="center"/>
             </w:pPr>
             <w:r/>
             <w:r>
@@ -5020,6 +5394,7 @@
           <w:p>
             <w:pPr>
               <w:spacing w:before="40" w:after="40"/>
+              <w:jc w:val="center"/>
             </w:pPr>
             <w:r/>
             <w:r>
@@ -5041,132 +5416,7 @@
           <w:p>
             <w:pPr>
               <w:spacing w:before="40" w:after="40"/>
-            </w:pPr>
-            <w:r/>
-            <w:r>
-              <w:rPr>
-                <w:rFonts w:ascii="Times New Roman" w:hAnsi="Times New Roman"/>
-                <w:b w:val="0"/>
-                <w:i w:val="0"/>
-                <w:sz w:val="19"/>
-              </w:rPr>
-              <w:t>2</w:t>
-            </w:r>
-          </w:p>
-        </w:tc>
-        <w:tc>
-          <w:tcPr>
-            <w:tcW w:w="642" w:type="dxa"/>
-            <w:vAlign w:val="center"/>
-          </w:tcPr>
-          <w:p>
-            <w:pPr>
-              <w:spacing w:before="40" w:after="40"/>
-            </w:pPr>
-            <w:r/>
-            <w:r>
-              <w:rPr>
-                <w:rFonts w:ascii="Times New Roman" w:hAnsi="Times New Roman"/>
-                <w:b w:val="0"/>
-                <w:i w:val="0"/>
-                <w:sz w:val="19"/>
-              </w:rPr>
-              <w:t>3</w:t>
-            </w:r>
-          </w:p>
-        </w:tc>
-        <w:tc>
-          <w:tcPr>
-            <w:tcW w:w="642" w:type="dxa"/>
-            <w:vAlign w:val="center"/>
-          </w:tcPr>
-          <w:p>
-            <w:pPr>
-              <w:spacing w:before="40" w:after="40"/>
-            </w:pPr>
-            <w:r/>
-            <w:r>
-              <w:rPr>
-                <w:rFonts w:ascii="Times New Roman" w:hAnsi="Times New Roman"/>
-                <w:b w:val="0"/>
-                <w:i w:val="0"/>
-                <w:sz w:val="19"/>
-              </w:rPr>
-              <w:t>-</w:t>
-            </w:r>
-          </w:p>
-        </w:tc>
-        <w:tc>
-          <w:tcPr>
-            <w:tcW w:w="642" w:type="dxa"/>
-            <w:vAlign w:val="center"/>
-          </w:tcPr>
-          <w:p>
-            <w:pPr>
-              <w:spacing w:before="40" w:after="40"/>
-            </w:pPr>
-            <w:r/>
-            <w:r>
-              <w:rPr>
-                <w:rFonts w:ascii="Times New Roman" w:hAnsi="Times New Roman"/>
-                <w:b w:val="0"/>
-                <w:i w:val="0"/>
-                <w:sz w:val="19"/>
-              </w:rPr>
-              <w:t>3</w:t>
-            </w:r>
-          </w:p>
-        </w:tc>
-        <w:tc>
-          <w:tcPr>
-            <w:tcW w:w="642" w:type="dxa"/>
-            <w:vAlign w:val="center"/>
-          </w:tcPr>
-          <w:p>
-            <w:pPr>
-              <w:spacing w:before="40" w:after="40"/>
-            </w:pPr>
-            <w:r/>
-            <w:r>
-              <w:rPr>
-                <w:rFonts w:ascii="Times New Roman" w:hAnsi="Times New Roman"/>
-                <w:b w:val="0"/>
-                <w:i w:val="0"/>
-                <w:sz w:val="19"/>
-              </w:rPr>
-              <w:t>3</w:t>
-            </w:r>
-          </w:p>
-        </w:tc>
-        <w:tc>
-          <w:tcPr>
-            <w:tcW w:w="642" w:type="dxa"/>
-            <w:vAlign w:val="center"/>
-          </w:tcPr>
-          <w:p>
-            <w:pPr>
-              <w:spacing w:before="40" w:after="40"/>
-            </w:pPr>
-            <w:r/>
-            <w:r>
-              <w:rPr>
-                <w:rFonts w:ascii="Times New Roman" w:hAnsi="Times New Roman"/>
-                <w:b w:val="0"/>
-                <w:i w:val="0"/>
-                <w:sz w:val="19"/>
-              </w:rPr>
-              <w:t>2</w:t>
-            </w:r>
-          </w:p>
-        </w:tc>
-        <w:tc>
-          <w:tcPr>
-            <w:tcW w:w="642" w:type="dxa"/>
-            <w:vAlign w:val="center"/>
-          </w:tcPr>
-          <w:p>
-            <w:pPr>
-              <w:spacing w:before="40" w:after="40"/>
+              <w:jc w:val="center"/>
             </w:pPr>
             <w:r/>
             <w:r>
@@ -5194,18 +5444,18 @@
           </w:tcPr>
           <w:p>
             <w:pPr>
-              <w:spacing w:after="40" w:line="264" w:lineRule="auto"/>
-              <w:jc w:val="center"/>
-            </w:pPr>
+              <w:spacing w:before="40" w:after="40"/>
+              <w:jc w:val="center"/>
+            </w:pPr>
+            <w:r/>
             <w:r>
               <w:rPr>
                 <w:rFonts w:ascii="Times New Roman" w:hAnsi="Times New Roman"/>
                 <w:b/>
-                <w:bCs/>
-                <w:sz w:val="18"/>
-                <w:szCs w:val="18"/>
-              </w:rPr>
-              <w:t>Avg.</w:t>
+                <w:i w:val="0"/>
+                <w:sz w:val="19"/>
+              </w:rPr>
+              <w:t>CO5</w:t>
             </w:r>
           </w:p>
         </w:tc>
@@ -5216,9 +5466,19 @@
           </w:tcPr>
           <w:p>
             <w:pPr>
-              <w:spacing w:after="40" w:line="264" w:lineRule="auto"/>
-              <w:jc w:val="center"/>
-            </w:pPr>
+              <w:spacing w:before="40" w:after="40"/>
+              <w:jc w:val="center"/>
+            </w:pPr>
+            <w:r/>
+            <w:r>
+              <w:rPr>
+                <w:rFonts w:ascii="Times New Roman" w:hAnsi="Times New Roman"/>
+                <w:b w:val="0"/>
+                <w:i w:val="0"/>
+                <w:sz w:val="19"/>
+              </w:rPr>
+              <w:t>3</w:t>
+            </w:r>
           </w:p>
         </w:tc>
         <w:tc>
@@ -5228,9 +5488,19 @@
           </w:tcPr>
           <w:p>
             <w:pPr>
-              <w:spacing w:after="40" w:line="264" w:lineRule="auto"/>
-              <w:jc w:val="center"/>
-            </w:pPr>
+              <w:spacing w:before="40" w:after="40"/>
+              <w:jc w:val="center"/>
+            </w:pPr>
+            <w:r/>
+            <w:r>
+              <w:rPr>
+                <w:rFonts w:ascii="Times New Roman" w:hAnsi="Times New Roman"/>
+                <w:b w:val="0"/>
+                <w:i w:val="0"/>
+                <w:sz w:val="19"/>
+              </w:rPr>
+              <w:t>2</w:t>
+            </w:r>
           </w:p>
         </w:tc>
         <w:tc>
@@ -5240,9 +5510,19 @@
           </w:tcPr>
           <w:p>
             <w:pPr>
-              <w:spacing w:after="40" w:line="264" w:lineRule="auto"/>
-              <w:jc w:val="center"/>
-            </w:pPr>
+              <w:spacing w:before="40" w:after="40"/>
+              <w:jc w:val="center"/>
+            </w:pPr>
+            <w:r/>
+            <w:r>
+              <w:rPr>
+                <w:rFonts w:ascii="Times New Roman" w:hAnsi="Times New Roman"/>
+                <w:b w:val="0"/>
+                <w:i w:val="0"/>
+                <w:sz w:val="19"/>
+              </w:rPr>
+              <w:t>2</w:t>
+            </w:r>
           </w:p>
         </w:tc>
         <w:tc>
@@ -5252,9 +5532,19 @@
           </w:tcPr>
           <w:p>
             <w:pPr>
-              <w:spacing w:after="40" w:line="264" w:lineRule="auto"/>
-              <w:jc w:val="center"/>
-            </w:pPr>
+              <w:spacing w:before="40" w:after="40"/>
+              <w:jc w:val="center"/>
+            </w:pPr>
+            <w:r/>
+            <w:r>
+              <w:rPr>
+                <w:rFonts w:ascii="Times New Roman" w:hAnsi="Times New Roman"/>
+                <w:b w:val="0"/>
+                <w:i w:val="0"/>
+                <w:sz w:val="19"/>
+              </w:rPr>
+              <w:t>3</w:t>
+            </w:r>
           </w:p>
         </w:tc>
         <w:tc>
@@ -5264,9 +5554,19 @@
           </w:tcPr>
           <w:p>
             <w:pPr>
-              <w:spacing w:after="40" w:line="264" w:lineRule="auto"/>
-              <w:jc w:val="center"/>
-            </w:pPr>
+              <w:spacing w:before="40" w:after="40"/>
+              <w:jc w:val="center"/>
+            </w:pPr>
+            <w:r/>
+            <w:r>
+              <w:rPr>
+                <w:rFonts w:ascii="Times New Roman" w:hAnsi="Times New Roman"/>
+                <w:b w:val="0"/>
+                <w:i w:val="0"/>
+                <w:sz w:val="19"/>
+              </w:rPr>
+              <w:t>3</w:t>
+            </w:r>
           </w:p>
         </w:tc>
         <w:tc>
@@ -5276,9 +5576,19 @@
           </w:tcPr>
           <w:p>
             <w:pPr>
-              <w:spacing w:after="40" w:line="264" w:lineRule="auto"/>
-              <w:jc w:val="center"/>
-            </w:pPr>
+              <w:spacing w:before="40" w:after="40"/>
+              <w:jc w:val="center"/>
+            </w:pPr>
+            <w:r/>
+            <w:r>
+              <w:rPr>
+                <w:rFonts w:ascii="Times New Roman" w:hAnsi="Times New Roman"/>
+                <w:b w:val="0"/>
+                <w:i w:val="0"/>
+                <w:sz w:val="19"/>
+              </w:rPr>
+              <w:t>–</w:t>
+            </w:r>
           </w:p>
         </w:tc>
         <w:tc>
@@ -5288,9 +5598,19 @@
           </w:tcPr>
           <w:p>
             <w:pPr>
-              <w:spacing w:after="40" w:line="264" w:lineRule="auto"/>
-              <w:jc w:val="center"/>
-            </w:pPr>
+              <w:spacing w:before="40" w:after="40"/>
+              <w:jc w:val="center"/>
+            </w:pPr>
+            <w:r/>
+            <w:r>
+              <w:rPr>
+                <w:rFonts w:ascii="Times New Roman" w:hAnsi="Times New Roman"/>
+                <w:b w:val="0"/>
+                <w:i w:val="0"/>
+                <w:sz w:val="19"/>
+              </w:rPr>
+              <w:t>–</w:t>
+            </w:r>
           </w:p>
         </w:tc>
         <w:tc>
@@ -5300,9 +5620,19 @@
           </w:tcPr>
           <w:p>
             <w:pPr>
-              <w:spacing w:after="40" w:line="264" w:lineRule="auto"/>
-              <w:jc w:val="center"/>
-            </w:pPr>
+              <w:spacing w:before="40" w:after="40"/>
+              <w:jc w:val="center"/>
+            </w:pPr>
+            <w:r/>
+            <w:r>
+              <w:rPr>
+                <w:rFonts w:ascii="Times New Roman" w:hAnsi="Times New Roman"/>
+                <w:b w:val="0"/>
+                <w:i w:val="0"/>
+                <w:sz w:val="19"/>
+              </w:rPr>
+              <w:t>–</w:t>
+            </w:r>
           </w:p>
         </w:tc>
         <w:tc>
@@ -5312,9 +5642,19 @@
           </w:tcPr>
           <w:p>
             <w:pPr>
-              <w:spacing w:after="40" w:line="264" w:lineRule="auto"/>
-              <w:jc w:val="center"/>
-            </w:pPr>
+              <w:spacing w:before="40" w:after="40"/>
+              <w:jc w:val="center"/>
+            </w:pPr>
+            <w:r/>
+            <w:r>
+              <w:rPr>
+                <w:rFonts w:ascii="Times New Roman" w:hAnsi="Times New Roman"/>
+                <w:b w:val="0"/>
+                <w:i w:val="0"/>
+                <w:sz w:val="19"/>
+              </w:rPr>
+              <w:t>–</w:t>
+            </w:r>
           </w:p>
         </w:tc>
         <w:tc>
@@ -5324,9 +5664,19 @@
           </w:tcPr>
           <w:p>
             <w:pPr>
-              <w:spacing w:after="40" w:line="264" w:lineRule="auto"/>
-              <w:jc w:val="center"/>
-            </w:pPr>
+              <w:spacing w:before="40" w:after="40"/>
+              <w:jc w:val="center"/>
+            </w:pPr>
+            <w:r/>
+            <w:r>
+              <w:rPr>
+                <w:rFonts w:ascii="Times New Roman" w:hAnsi="Times New Roman"/>
+                <w:b w:val="0"/>
+                <w:i w:val="0"/>
+                <w:sz w:val="19"/>
+              </w:rPr>
+              <w:t>–</w:t>
+            </w:r>
           </w:p>
         </w:tc>
         <w:tc>
@@ -5336,9 +5686,19 @@
           </w:tcPr>
           <w:p>
             <w:pPr>
-              <w:spacing w:after="40" w:line="264" w:lineRule="auto"/>
-              <w:jc w:val="center"/>
-            </w:pPr>
+              <w:spacing w:before="40" w:after="40"/>
+              <w:jc w:val="center"/>
+            </w:pPr>
+            <w:r/>
+            <w:r>
+              <w:rPr>
+                <w:rFonts w:ascii="Times New Roman" w:hAnsi="Times New Roman"/>
+                <w:b w:val="0"/>
+                <w:i w:val="0"/>
+                <w:sz w:val="19"/>
+              </w:rPr>
+              <w:t>2</w:t>
+            </w:r>
           </w:p>
         </w:tc>
         <w:tc>
@@ -5348,9 +5708,19 @@
           </w:tcPr>
           <w:p>
             <w:pPr>
-              <w:spacing w:after="40" w:line="264" w:lineRule="auto"/>
-              <w:jc w:val="center"/>
-            </w:pPr>
+              <w:spacing w:before="40" w:after="40"/>
+              <w:jc w:val="center"/>
+            </w:pPr>
+            <w:r/>
+            <w:r>
+              <w:rPr>
+                <w:rFonts w:ascii="Times New Roman" w:hAnsi="Times New Roman"/>
+                <w:b w:val="0"/>
+                <w:i w:val="0"/>
+                <w:sz w:val="19"/>
+              </w:rPr>
+              <w:t>3</w:t>
+            </w:r>
           </w:p>
         </w:tc>
         <w:tc>
@@ -5360,9 +5730,611 @@
           </w:tcPr>
           <w:p>
             <w:pPr>
-              <w:spacing w:after="40" w:line="264" w:lineRule="auto"/>
-              <w:jc w:val="center"/>
-            </w:pPr>
+              <w:spacing w:before="40" w:after="40"/>
+              <w:jc w:val="center"/>
+            </w:pPr>
+            <w:r/>
+            <w:r>
+              <w:rPr>
+                <w:rFonts w:ascii="Times New Roman" w:hAnsi="Times New Roman"/>
+                <w:b w:val="0"/>
+                <w:i w:val="0"/>
+                <w:sz w:val="19"/>
+              </w:rPr>
+              <w:t>2</w:t>
+            </w:r>
+          </w:p>
+        </w:tc>
+      </w:tr>
+      <w:tr>
+        <w:tc>
+          <w:tcPr>
+            <w:tcW w:type="dxa" w:w="1000"/>
+          </w:tcPr>
+          <w:p>
+            <w:pPr>
+              <w:spacing w:before="40" w:after="40"/>
+              <w:jc w:val="center"/>
+            </w:pPr>
+            <w:r/>
+            <w:r>
+              <w:rPr>
+                <w:rFonts w:ascii="Times New Roman" w:hAnsi="Times New Roman"/>
+                <w:b/>
+                <w:i w:val="0"/>
+                <w:sz w:val="19"/>
+              </w:rPr>
+              <w:t>CO6</w:t>
+            </w:r>
+          </w:p>
+        </w:tc>
+        <w:tc>
+          <w:tcPr>
+            <w:tcW w:type="dxa" w:w="642"/>
+          </w:tcPr>
+          <w:p>
+            <w:pPr>
+              <w:spacing w:before="40" w:after="40"/>
+              <w:jc w:val="center"/>
+            </w:pPr>
+            <w:r/>
+            <w:r>
+              <w:rPr>
+                <w:rFonts w:ascii="Times New Roman" w:hAnsi="Times New Roman"/>
+                <w:b w:val="0"/>
+                <w:i w:val="0"/>
+                <w:sz w:val="19"/>
+              </w:rPr>
+              <w:t>3</w:t>
+            </w:r>
+          </w:p>
+        </w:tc>
+        <w:tc>
+          <w:tcPr>
+            <w:tcW w:type="dxa" w:w="642"/>
+          </w:tcPr>
+          <w:p>
+            <w:pPr>
+              <w:spacing w:before="40" w:after="40"/>
+              <w:jc w:val="center"/>
+            </w:pPr>
+            <w:r/>
+            <w:r>
+              <w:rPr>
+                <w:rFonts w:ascii="Times New Roman" w:hAnsi="Times New Roman"/>
+                <w:b w:val="0"/>
+                <w:i w:val="0"/>
+                <w:sz w:val="19"/>
+              </w:rPr>
+              <w:t>3</w:t>
+            </w:r>
+          </w:p>
+        </w:tc>
+        <w:tc>
+          <w:tcPr>
+            <w:tcW w:type="dxa" w:w="642"/>
+          </w:tcPr>
+          <w:p>
+            <w:pPr>
+              <w:spacing w:before="40" w:after="40"/>
+              <w:jc w:val="center"/>
+            </w:pPr>
+            <w:r/>
+            <w:r>
+              <w:rPr>
+                <w:rFonts w:ascii="Times New Roman" w:hAnsi="Times New Roman"/>
+                <w:b w:val="0"/>
+                <w:i w:val="0"/>
+                <w:sz w:val="19"/>
+              </w:rPr>
+              <w:t>3</w:t>
+            </w:r>
+          </w:p>
+        </w:tc>
+        <w:tc>
+          <w:tcPr>
+            <w:tcW w:type="dxa" w:w="642"/>
+          </w:tcPr>
+          <w:p>
+            <w:pPr>
+              <w:spacing w:before="40" w:after="40"/>
+              <w:jc w:val="center"/>
+            </w:pPr>
+            <w:r/>
+            <w:r>
+              <w:rPr>
+                <w:rFonts w:ascii="Times New Roman" w:hAnsi="Times New Roman"/>
+                <w:b w:val="0"/>
+                <w:i w:val="0"/>
+                <w:sz w:val="19"/>
+              </w:rPr>
+              <w:t>3</w:t>
+            </w:r>
+          </w:p>
+        </w:tc>
+        <w:tc>
+          <w:tcPr>
+            <w:tcW w:type="dxa" w:w="642"/>
+          </w:tcPr>
+          <w:p>
+            <w:pPr>
+              <w:spacing w:before="40" w:after="40"/>
+              <w:jc w:val="center"/>
+            </w:pPr>
+            <w:r/>
+            <w:r>
+              <w:rPr>
+                <w:rFonts w:ascii="Times New Roman" w:hAnsi="Times New Roman"/>
+                <w:b w:val="0"/>
+                <w:i w:val="0"/>
+                <w:sz w:val="19"/>
+              </w:rPr>
+              <w:t>3</w:t>
+            </w:r>
+          </w:p>
+        </w:tc>
+        <w:tc>
+          <w:tcPr>
+            <w:tcW w:type="dxa" w:w="642"/>
+          </w:tcPr>
+          <w:p>
+            <w:pPr>
+              <w:spacing w:before="40" w:after="40"/>
+              <w:jc w:val="center"/>
+            </w:pPr>
+            <w:r/>
+            <w:r>
+              <w:rPr>
+                <w:rFonts w:ascii="Times New Roman" w:hAnsi="Times New Roman"/>
+                <w:b w:val="0"/>
+                <w:i w:val="0"/>
+                <w:sz w:val="19"/>
+              </w:rPr>
+              <w:t>2</w:t>
+            </w:r>
+          </w:p>
+        </w:tc>
+        <w:tc>
+          <w:tcPr>
+            <w:tcW w:type="dxa" w:w="642"/>
+          </w:tcPr>
+          <w:p>
+            <w:pPr>
+              <w:spacing w:before="40" w:after="40"/>
+              <w:jc w:val="center"/>
+            </w:pPr>
+            <w:r/>
+            <w:r>
+              <w:rPr>
+                <w:rFonts w:ascii="Times New Roman" w:hAnsi="Times New Roman"/>
+                <w:b w:val="0"/>
+                <w:i w:val="0"/>
+                <w:sz w:val="19"/>
+              </w:rPr>
+              <w:t>2</w:t>
+            </w:r>
+          </w:p>
+        </w:tc>
+        <w:tc>
+          <w:tcPr>
+            <w:tcW w:type="dxa" w:w="642"/>
+          </w:tcPr>
+          <w:p>
+            <w:pPr>
+              <w:spacing w:before="40" w:after="40"/>
+              <w:jc w:val="center"/>
+            </w:pPr>
+            <w:r/>
+            <w:r>
+              <w:rPr>
+                <w:rFonts w:ascii="Times New Roman" w:hAnsi="Times New Roman"/>
+                <w:b w:val="0"/>
+                <w:i w:val="0"/>
+                <w:sz w:val="19"/>
+              </w:rPr>
+              <w:t>3</w:t>
+            </w:r>
+          </w:p>
+        </w:tc>
+        <w:tc>
+          <w:tcPr>
+            <w:tcW w:type="dxa" w:w="642"/>
+          </w:tcPr>
+          <w:p>
+            <w:pPr>
+              <w:spacing w:before="40" w:after="40"/>
+              <w:jc w:val="center"/>
+            </w:pPr>
+            <w:r/>
+            <w:r>
+              <w:rPr>
+                <w:rFonts w:ascii="Times New Roman" w:hAnsi="Times New Roman"/>
+                <w:b w:val="0"/>
+                <w:i w:val="0"/>
+                <w:sz w:val="19"/>
+              </w:rPr>
+              <w:t>3</w:t>
+            </w:r>
+          </w:p>
+        </w:tc>
+        <w:tc>
+          <w:tcPr>
+            <w:tcW w:type="dxa" w:w="642"/>
+          </w:tcPr>
+          <w:p>
+            <w:pPr>
+              <w:spacing w:before="40" w:after="40"/>
+              <w:jc w:val="center"/>
+            </w:pPr>
+            <w:r/>
+            <w:r>
+              <w:rPr>
+                <w:rFonts w:ascii="Times New Roman" w:hAnsi="Times New Roman"/>
+                <w:b w:val="0"/>
+                <w:i w:val="0"/>
+                <w:sz w:val="19"/>
+              </w:rPr>
+              <w:t>2</w:t>
+            </w:r>
+          </w:p>
+        </w:tc>
+        <w:tc>
+          <w:tcPr>
+            <w:tcW w:type="dxa" w:w="642"/>
+          </w:tcPr>
+          <w:p>
+            <w:pPr>
+              <w:spacing w:before="40" w:after="40"/>
+              <w:jc w:val="center"/>
+            </w:pPr>
+            <w:r/>
+            <w:r>
+              <w:rPr>
+                <w:rFonts w:ascii="Times New Roman" w:hAnsi="Times New Roman"/>
+                <w:b w:val="0"/>
+                <w:i w:val="0"/>
+                <w:sz w:val="19"/>
+              </w:rPr>
+              <w:t>3</w:t>
+            </w:r>
+          </w:p>
+        </w:tc>
+        <w:tc>
+          <w:tcPr>
+            <w:tcW w:type="dxa" w:w="642"/>
+          </w:tcPr>
+          <w:p>
+            <w:pPr>
+              <w:spacing w:before="40" w:after="40"/>
+              <w:jc w:val="center"/>
+            </w:pPr>
+            <w:r/>
+            <w:r>
+              <w:rPr>
+                <w:rFonts w:ascii="Times New Roman" w:hAnsi="Times New Roman"/>
+                <w:b w:val="0"/>
+                <w:i w:val="0"/>
+                <w:sz w:val="19"/>
+              </w:rPr>
+              <w:t>3</w:t>
+            </w:r>
+          </w:p>
+        </w:tc>
+        <w:tc>
+          <w:tcPr>
+            <w:tcW w:type="dxa" w:w="642"/>
+          </w:tcPr>
+          <w:p>
+            <w:pPr>
+              <w:spacing w:before="40" w:after="40"/>
+              <w:jc w:val="center"/>
+            </w:pPr>
+            <w:r/>
+            <w:r>
+              <w:rPr>
+                <w:rFonts w:ascii="Times New Roman" w:hAnsi="Times New Roman"/>
+                <w:b w:val="0"/>
+                <w:i w:val="0"/>
+                <w:sz w:val="19"/>
+              </w:rPr>
+              <w:t>3</w:t>
+            </w:r>
+          </w:p>
+        </w:tc>
+      </w:tr>
+      <w:tr>
+        <w:tc>
+          <w:tcPr>
+            <w:tcW w:type="dxa" w:w="1000"/>
+          </w:tcPr>
+          <w:p>
+            <w:pPr>
+              <w:spacing w:before="40" w:after="40"/>
+              <w:jc w:val="center"/>
+            </w:pPr>
+            <w:r/>
+            <w:r>
+              <w:rPr>
+                <w:rFonts w:ascii="Times New Roman" w:hAnsi="Times New Roman"/>
+                <w:b/>
+                <w:i w:val="0"/>
+                <w:sz w:val="19"/>
+              </w:rPr>
+              <w:t>Average</w:t>
+            </w:r>
+          </w:p>
+        </w:tc>
+        <w:tc>
+          <w:tcPr>
+            <w:tcW w:type="dxa" w:w="642"/>
+          </w:tcPr>
+          <w:p>
+            <w:pPr>
+              <w:spacing w:before="40" w:after="40"/>
+              <w:jc w:val="center"/>
+            </w:pPr>
+            <w:r/>
+            <w:r>
+              <w:rPr>
+                <w:rFonts w:ascii="Times New Roman" w:hAnsi="Times New Roman"/>
+                <w:b/>
+                <w:i w:val="0"/>
+                <w:sz w:val="19"/>
+              </w:rPr>
+              <w:t>3.0</w:t>
+            </w:r>
+          </w:p>
+        </w:tc>
+        <w:tc>
+          <w:tcPr>
+            <w:tcW w:type="dxa" w:w="642"/>
+          </w:tcPr>
+          <w:p>
+            <w:pPr>
+              <w:spacing w:before="40" w:after="40"/>
+              <w:jc w:val="center"/>
+            </w:pPr>
+            <w:r/>
+            <w:r>
+              <w:rPr>
+                <w:rFonts w:ascii="Times New Roman" w:hAnsi="Times New Roman"/>
+                <w:b/>
+                <w:i w:val="0"/>
+                <w:sz w:val="19"/>
+              </w:rPr>
+              <w:t>2.8</w:t>
+            </w:r>
+          </w:p>
+        </w:tc>
+        <w:tc>
+          <w:tcPr>
+            <w:tcW w:type="dxa" w:w="642"/>
+          </w:tcPr>
+          <w:p>
+            <w:pPr>
+              <w:spacing w:before="40" w:after="40"/>
+              <w:jc w:val="center"/>
+            </w:pPr>
+            <w:r/>
+            <w:r>
+              <w:rPr>
+                <w:rFonts w:ascii="Times New Roman" w:hAnsi="Times New Roman"/>
+                <w:b/>
+                <w:i w:val="0"/>
+                <w:sz w:val="19"/>
+              </w:rPr>
+              <w:t>2.6</w:t>
+            </w:r>
+          </w:p>
+        </w:tc>
+        <w:tc>
+          <w:tcPr>
+            <w:tcW w:type="dxa" w:w="642"/>
+          </w:tcPr>
+          <w:p>
+            <w:pPr>
+              <w:spacing w:before="40" w:after="40"/>
+              <w:jc w:val="center"/>
+            </w:pPr>
+            <w:r/>
+            <w:r>
+              <w:rPr>
+                <w:rFonts w:ascii="Times New Roman" w:hAnsi="Times New Roman"/>
+                <w:b/>
+                <w:i w:val="0"/>
+                <w:sz w:val="19"/>
+              </w:rPr>
+              <w:t>2.4</w:t>
+            </w:r>
+          </w:p>
+        </w:tc>
+        <w:tc>
+          <w:tcPr>
+            <w:tcW w:type="dxa" w:w="642"/>
+          </w:tcPr>
+          <w:p>
+            <w:pPr>
+              <w:spacing w:before="40" w:after="40"/>
+              <w:jc w:val="center"/>
+            </w:pPr>
+            <w:r/>
+            <w:r>
+              <w:rPr>
+                <w:rFonts w:ascii="Times New Roman" w:hAnsi="Times New Roman"/>
+                <w:b/>
+                <w:i w:val="0"/>
+                <w:sz w:val="19"/>
+              </w:rPr>
+              <w:t>3.0</w:t>
+            </w:r>
+          </w:p>
+        </w:tc>
+        <w:tc>
+          <w:tcPr>
+            <w:tcW w:type="dxa" w:w="642"/>
+          </w:tcPr>
+          <w:p>
+            <w:pPr>
+              <w:spacing w:before="40" w:after="40"/>
+              <w:jc w:val="center"/>
+            </w:pPr>
+            <w:r/>
+            <w:r>
+              <w:rPr>
+                <w:rFonts w:ascii="Times New Roman" w:hAnsi="Times New Roman"/>
+                <w:b/>
+                <w:i w:val="0"/>
+                <w:sz w:val="19"/>
+              </w:rPr>
+              <w:t>2.0</w:t>
+            </w:r>
+          </w:p>
+        </w:tc>
+        <w:tc>
+          <w:tcPr>
+            <w:tcW w:type="dxa" w:w="642"/>
+          </w:tcPr>
+          <w:p>
+            <w:pPr>
+              <w:spacing w:before="40" w:after="40"/>
+              <w:jc w:val="center"/>
+            </w:pPr>
+            <w:r/>
+            <w:r>
+              <w:rPr>
+                <w:rFonts w:ascii="Times New Roman" w:hAnsi="Times New Roman"/>
+                <w:b/>
+                <w:i w:val="0"/>
+                <w:sz w:val="19"/>
+              </w:rPr>
+              <w:t>2.0</w:t>
+            </w:r>
+          </w:p>
+        </w:tc>
+        <w:tc>
+          <w:tcPr>
+            <w:tcW w:type="dxa" w:w="642"/>
+          </w:tcPr>
+          <w:p>
+            <w:pPr>
+              <w:spacing w:before="40" w:after="40"/>
+              <w:jc w:val="center"/>
+            </w:pPr>
+            <w:r/>
+            <w:r>
+              <w:rPr>
+                <w:rFonts w:ascii="Times New Roman" w:hAnsi="Times New Roman"/>
+                <w:b/>
+                <w:i w:val="0"/>
+                <w:sz w:val="19"/>
+              </w:rPr>
+              <w:t>3.0</w:t>
+            </w:r>
+          </w:p>
+        </w:tc>
+        <w:tc>
+          <w:tcPr>
+            <w:tcW w:type="dxa" w:w="642"/>
+          </w:tcPr>
+          <w:p>
+            <w:pPr>
+              <w:spacing w:before="40" w:after="40"/>
+              <w:jc w:val="center"/>
+            </w:pPr>
+            <w:r/>
+            <w:r>
+              <w:rPr>
+                <w:rFonts w:ascii="Times New Roman" w:hAnsi="Times New Roman"/>
+                <w:b/>
+                <w:i w:val="0"/>
+                <w:sz w:val="19"/>
+              </w:rPr>
+              <w:t>2.5</w:t>
+            </w:r>
+          </w:p>
+        </w:tc>
+        <w:tc>
+          <w:tcPr>
+            <w:tcW w:type="dxa" w:w="642"/>
+          </w:tcPr>
+          <w:p>
+            <w:pPr>
+              <w:spacing w:before="40" w:after="40"/>
+              <w:jc w:val="center"/>
+            </w:pPr>
+            <w:r/>
+            <w:r>
+              <w:rPr>
+                <w:rFonts w:ascii="Times New Roman" w:hAnsi="Times New Roman"/>
+                <w:b/>
+                <w:i w:val="0"/>
+                <w:sz w:val="19"/>
+              </w:rPr>
+              <w:t>2.0</w:t>
+            </w:r>
+          </w:p>
+        </w:tc>
+        <w:tc>
+          <w:tcPr>
+            <w:tcW w:type="dxa" w:w="642"/>
+          </w:tcPr>
+          <w:p>
+            <w:pPr>
+              <w:spacing w:before="40" w:after="40"/>
+              <w:jc w:val="center"/>
+            </w:pPr>
+            <w:r/>
+            <w:r>
+              <w:rPr>
+                <w:rFonts w:ascii="Times New Roman" w:hAnsi="Times New Roman"/>
+                <w:b/>
+                <w:i w:val="0"/>
+                <w:sz w:val="19"/>
+              </w:rPr>
+              <w:t>2.2</w:t>
+            </w:r>
+          </w:p>
+        </w:tc>
+        <w:tc>
+          <w:tcPr>
+            <w:tcW w:type="dxa" w:w="642"/>
+          </w:tcPr>
+          <w:p>
+            <w:pPr>
+              <w:spacing w:before="40" w:after="40"/>
+              <w:jc w:val="center"/>
+            </w:pPr>
+            <w:r/>
+            <w:r>
+              <w:rPr>
+                <w:rFonts w:ascii="Times New Roman" w:hAnsi="Times New Roman"/>
+                <w:b/>
+                <w:i w:val="0"/>
+                <w:sz w:val="19"/>
+              </w:rPr>
+              <w:t>3.0</w:t>
+            </w:r>
+          </w:p>
+        </w:tc>
+        <w:tc>
+          <w:tcPr>
+            <w:tcW w:type="dxa" w:w="642"/>
+          </w:tcPr>
+          <w:p>
+            <w:pPr>
+              <w:spacing w:before="40" w:after="40"/>
+              <w:jc w:val="center"/>
+            </w:pPr>
+            <w:r/>
+            <w:r>
+              <w:rPr>
+                <w:rFonts w:ascii="Times New Roman" w:hAnsi="Times New Roman"/>
+                <w:b/>
+                <w:i w:val="0"/>
+                <w:sz w:val="19"/>
+              </w:rPr>
+              <w:t>2.4</w:t>
+            </w:r>
           </w:p>
         </w:tc>
       </w:tr>
@@ -5518,6 +6490,7 @@
           <w:p>
             <w:pPr>
               <w:spacing w:before="40" w:after="40"/>
+              <w:jc w:val="left"/>
             </w:pPr>
             <w:r/>
             <w:r>
@@ -5527,7 +6500,7 @@
                 <w:i w:val="0"/>
                 <w:sz w:val="19"/>
               </w:rPr>
-              <w:t>CO1 – PO1</w:t>
+              <w:t>CO1 – PO1 / PO5</w:t>
             </w:r>
           </w:p>
         </w:tc>
@@ -5539,6 +6512,7 @@
           <w:p>
             <w:pPr>
               <w:spacing w:before="40" w:after="40"/>
+              <w:jc w:val="center"/>
             </w:pPr>
             <w:r/>
             <w:r>
@@ -5560,16 +6534,17 @@
           <w:p>
             <w:pPr>
               <w:spacing w:before="40" w:after="40"/>
-            </w:pPr>
-            <w:r/>
-            <w:r>
-              <w:rPr>
-                <w:rFonts w:ascii="Times New Roman" w:hAnsi="Times New Roman"/>
-                <w:b w:val="0"/>
-                <w:i w:val="0"/>
-                <w:sz w:val="19"/>
-              </w:rPr>
-              <w:t>Applies mathematical principles of information theory and TF-IDF vectorization.</w:t>
+              <w:jc w:val="left"/>
+            </w:pPr>
+            <w:r/>
+            <w:r>
+              <w:rPr>
+                <w:rFonts w:ascii="Times New Roman" w:hAnsi="Times New Roman"/>
+                <w:b w:val="0"/>
+                <w:i w:val="0"/>
+                <w:sz w:val="19"/>
+              </w:rPr>
+              <w:t>Applies foundational principles of engineering mathematics and computational statistics (mean length, variance, standard deviation) using Python statistical libraries to characterize email data distributions.</w:t>
             </w:r>
           </w:p>
         </w:tc>
@@ -5588,6 +6563,7 @@
           <w:p>
             <w:pPr>
               <w:spacing w:before="40" w:after="40"/>
+              <w:jc w:val="left"/>
             </w:pPr>
             <w:r/>
             <w:r>
@@ -5597,7 +6573,7 @@
                 <w:i w:val="0"/>
                 <w:sz w:val="19"/>
               </w:rPr>
-              <w:t>CO2 – PO3</w:t>
+              <w:t>CO2 – PO5 / PSO1</w:t>
             </w:r>
           </w:p>
         </w:tc>
@@ -5609,6 +6585,7 @@
           <w:p>
             <w:pPr>
               <w:spacing w:before="40" w:after="40"/>
+              <w:jc w:val="center"/>
             </w:pPr>
             <w:r/>
             <w:r>
@@ -5630,16 +6607,17 @@
           <w:p>
             <w:pPr>
               <w:spacing w:before="40" w:after="40"/>
-            </w:pPr>
-            <w:r/>
-            <w:r>
-              <w:rPr>
-                <w:rFonts w:ascii="Times New Roman" w:hAnsi="Times New Roman"/>
-                <w:b w:val="0"/>
-                <w:i w:val="0"/>
-                <w:sz w:val="19"/>
-              </w:rPr>
-              <w:t>Designs and trains four supervised learning algorithms to solve cybersecurity spam threats.</w:t>
+              <w:jc w:val="left"/>
+            </w:pPr>
+            <w:r/>
+            <w:r>
+              <w:rPr>
+                <w:rFonts w:ascii="Times New Roman" w:hAnsi="Times New Roman"/>
+                <w:b w:val="0"/>
+                <w:i w:val="0"/>
+                <w:sz w:val="19"/>
+              </w:rPr>
+              <w:t>Employs modern data science tools (NumPy, Pandas, Matplotlib, Seaborn) to execute data cleaning, regex masking, tokenization, and render high-resolution exploratory data visualizations.</w:t>
             </w:r>
           </w:p>
         </w:tc>
@@ -5658,6 +6636,7 @@
           <w:p>
             <w:pPr>
               <w:spacing w:before="40" w:after="40"/>
+              <w:jc w:val="left"/>
             </w:pPr>
             <w:r/>
             <w:r>
@@ -5667,7 +6646,7 @@
                 <w:i w:val="0"/>
                 <w:sz w:val="19"/>
               </w:rPr>
-              <w:t>CO3 – PO4</w:t>
+              <w:t>CO3 – PO3 / PSO1</w:t>
             </w:r>
           </w:p>
         </w:tc>
@@ -5679,6 +6658,7 @@
           <w:p>
             <w:pPr>
               <w:spacing w:before="40" w:after="40"/>
+              <w:jc w:val="center"/>
             </w:pPr>
             <w:r/>
             <w:r>
@@ -5700,16 +6680,17 @@
           <w:p>
             <w:pPr>
               <w:spacing w:before="40" w:after="40"/>
-            </w:pPr>
-            <w:r/>
-            <w:r>
-              <w:rPr>
-                <w:rFonts w:ascii="Times New Roman" w:hAnsi="Times New Roman"/>
-                <w:b w:val="0"/>
-                <w:i w:val="0"/>
-                <w:sz w:val="19"/>
-              </w:rPr>
-              <w:t>Conducts empirical investigation and error analysis on held-out test data.</w:t>
+              <w:jc w:val="left"/>
+            </w:pPr>
+            <w:r/>
+            <w:r>
+              <w:rPr>
+                <w:rFonts w:ascii="Times New Roman" w:hAnsi="Times New Roman"/>
+                <w:b w:val="0"/>
+                <w:i w:val="0"/>
+                <w:sz w:val="19"/>
+              </w:rPr>
+              <w:t>Designs and implements supervised machine learning classification algorithms (Logistic Regression, Decision Trees / Random Forest, and Naive Bayes) using scikit-learn to solve digital spam threats.</w:t>
             </w:r>
           </w:p>
         </w:tc>
@@ -5728,6 +6709,7 @@
           <w:p>
             <w:pPr>
               <w:spacing w:before="40" w:after="40"/>
+              <w:jc w:val="left"/>
             </w:pPr>
             <w:r/>
             <w:r>
@@ -5737,7 +6719,7 @@
                 <w:i w:val="0"/>
                 <w:sz w:val="19"/>
               </w:rPr>
-              <w:t>CO2 – PO5</w:t>
+              <w:t>CO4 – PO4 / PSO1</w:t>
             </w:r>
           </w:p>
         </w:tc>
@@ -5749,6 +6731,7 @@
           <w:p>
             <w:pPr>
               <w:spacing w:before="40" w:after="40"/>
+              <w:jc w:val="center"/>
             </w:pPr>
             <w:r/>
             <w:r>
@@ -5770,16 +6753,17 @@
           <w:p>
             <w:pPr>
               <w:spacing w:before="40" w:after="40"/>
-            </w:pPr>
-            <w:r/>
-            <w:r>
-              <w:rPr>
-                <w:rFonts w:ascii="Times New Roman" w:hAnsi="Times New Roman"/>
-                <w:b w:val="0"/>
-                <w:i w:val="0"/>
-                <w:sz w:val="19"/>
-              </w:rPr>
-              <w:t>Uses modern engineering tools including scikit-learn, NLTK, and Streamlit.</w:t>
+              <w:jc w:val="left"/>
+            </w:pPr>
+            <w:r/>
+            <w:r>
+              <w:rPr>
+                <w:rFonts w:ascii="Times New Roman" w:hAnsi="Times New Roman"/>
+                <w:b w:val="0"/>
+                <w:i w:val="0"/>
+                <w:sz w:val="19"/>
+              </w:rPr>
+              <w:t>Conducts structured investigations of model performance via 5-fold cross-validation, hyperparameter grid search, and cost-sensitive evaluation prioritizing high Precision to prevent false positives.</w:t>
             </w:r>
           </w:p>
         </w:tc>
@@ -5798,6 +6782,7 @@
           <w:p>
             <w:pPr>
               <w:spacing w:before="40" w:after="40"/>
+              <w:jc w:val="left"/>
             </w:pPr>
             <w:r/>
             <w:r>
@@ -5807,7 +6792,7 @@
                 <w:i w:val="0"/>
                 <w:sz w:val="19"/>
               </w:rPr>
-              <w:t>CO4 – PO8</w:t>
+              <w:t>CO5 – PO4 / PSO2</w:t>
             </w:r>
           </w:p>
         </w:tc>
@@ -5819,6 +6804,7 @@
           <w:p>
             <w:pPr>
               <w:spacing w:before="40" w:after="40"/>
+              <w:jc w:val="center"/>
             </w:pPr>
             <w:r/>
             <w:r>
@@ -5840,16 +6826,17 @@
           <w:p>
             <w:pPr>
               <w:spacing w:before="40" w:after="40"/>
-            </w:pPr>
-            <w:r/>
-            <w:r>
-              <w:rPr>
-                <w:rFonts w:ascii="Times New Roman" w:hAnsi="Times New Roman"/>
-                <w:b w:val="0"/>
-                <w:i w:val="0"/>
-                <w:sz w:val="19"/>
-              </w:rPr>
-              <w:t>Evaluates privacy and ethical implications of inspecting private email content.</w:t>
+              <w:jc w:val="left"/>
+            </w:pPr>
+            <w:r/>
+            <w:r>
+              <w:rPr>
+                <w:rFonts w:ascii="Times New Roman" w:hAnsi="Times New Roman"/>
+                <w:b w:val="0"/>
+                <w:i w:val="0"/>
+                <w:sz w:val="19"/>
+              </w:rPr>
+              <w:t>Applies unsupervised clustering techniques (K-Means) to explore semantic grouping and natural topic clusters within high-dimensional sparse TF-IDF text vectors.</w:t>
             </w:r>
           </w:p>
         </w:tc>
@@ -5868,6 +6855,7 @@
           <w:p>
             <w:pPr>
               <w:spacing w:before="40" w:after="40"/>
+              <w:jc w:val="left"/>
             </w:pPr>
             <w:r/>
             <w:r>
@@ -5877,7 +6865,7 @@
                 <w:i w:val="0"/>
                 <w:sz w:val="19"/>
               </w:rPr>
-              <w:t>CO2 – PSO1</w:t>
+              <w:t>CO6 – PO3 / PO9 / PO11 / PSO1 / PSO2</w:t>
             </w:r>
           </w:p>
         </w:tc>
@@ -5889,6 +6877,7 @@
           <w:p>
             <w:pPr>
               <w:spacing w:before="40" w:after="40"/>
+              <w:jc w:val="center"/>
             </w:pPr>
             <w:r/>
             <w:r>
@@ -5910,16 +6899,17 @@
           <w:p>
             <w:pPr>
               <w:spacing w:before="40" w:after="40"/>
-            </w:pPr>
-            <w:r/>
-            <w:r>
-              <w:rPr>
-                <w:rFonts w:ascii="Times New Roman" w:hAnsi="Times New Roman"/>
-                <w:b w:val="0"/>
-                <w:i w:val="0"/>
-                <w:sz w:val="19"/>
-              </w:rPr>
-              <w:t>Applies AI/ML algorithms to solve practical digital communications challenges.</w:t>
+              <w:jc w:val="left"/>
+            </w:pPr>
+            <w:r/>
+            <w:r>
+              <w:rPr>
+                <w:rFonts w:ascii="Times New Roman" w:hAnsi="Times New Roman"/>
+                <w:b w:val="0"/>
+                <w:i w:val="0"/>
+                <w:sz w:val="19"/>
+              </w:rPr>
+              <w:t>Accomplishes a complete end-to-end classification mini-project, conducting rigorous comparative benchmarking, error analysis, technical report preparation, presentation delivery, and real-time deployment.</w:t>
             </w:r>
           </w:p>
         </w:tc>
@@ -6058,16 +7048,16 @@
           </w:tcPr>
           <w:p>
             <w:pPr>
-              <w:spacing w:after="40" w:line="264" w:lineRule="auto"/>
-              <w:jc w:val="center"/>
-            </w:pPr>
+              <w:spacing w:before="40" w:after="40"/>
+              <w:jc w:val="center"/>
+            </w:pPr>
+            <w:r/>
             <w:r>
               <w:rPr>
                 <w:rFonts w:ascii="Times New Roman" w:hAnsi="Times New Roman"/>
                 <w:b/>
-                <w:bCs/>
-                <w:sz w:val="19"/>
-                <w:szCs w:val="19"/>
+                <w:i w:val="0"/>
+                <w:sz w:val="19"/>
               </w:rPr>
               <w:t>PO1</w:t>
             </w:r>
@@ -6080,13 +7070,16 @@
           </w:tcPr>
           <w:p>
             <w:pPr>
-              <w:spacing w:after="40" w:line="264" w:lineRule="auto"/>
-            </w:pPr>
-            <w:r>
-              <w:rPr>
-                <w:rFonts w:ascii="Times New Roman" w:hAnsi="Times New Roman"/>
-                <w:sz w:val="19"/>
-                <w:szCs w:val="19"/>
+              <w:spacing w:before="40" w:after="40"/>
+              <w:jc w:val="left"/>
+            </w:pPr>
+            <w:r/>
+            <w:r>
+              <w:rPr>
+                <w:rFonts w:ascii="Times New Roman" w:hAnsi="Times New Roman"/>
+                <w:b/>
+                <w:i w:val="0"/>
+                <w:sz w:val="19"/>
               </w:rPr>
               <w:t>Engineering Knowledge</w:t>
             </w:r>
@@ -6099,15 +7092,18 @@
           </w:tcPr>
           <w:p>
             <w:pPr>
-              <w:spacing w:after="40" w:line="264" w:lineRule="auto"/>
-            </w:pPr>
-            <w:r>
-              <w:rPr>
-                <w:rFonts w:ascii="Times New Roman" w:hAnsi="Times New Roman"/>
-                <w:sz w:val="19"/>
-                <w:szCs w:val="19"/>
-              </w:rPr>
-              <w:t>Apply knowledge of mathematics, natural science, computing, engineering fundamentals and specialisation; conceptual models</w:t>
+              <w:spacing w:before="40" w:after="40"/>
+              <w:jc w:val="left"/>
+            </w:pPr>
+            <w:r/>
+            <w:r>
+              <w:rPr>
+                <w:rFonts w:ascii="Times New Roman" w:hAnsi="Times New Roman"/>
+                <w:b w:val="0"/>
+                <w:i w:val="0"/>
+                <w:sz w:val="19"/>
+              </w:rPr>
+              <w:t>Apply knowledge of mathematics, natural science, computing, engineering fundamentals and an engineering specialization as specified in WK1 to WK4 respectively to develop the solution of complex engineering problems.</w:t>
             </w:r>
           </w:p>
         </w:tc>
@@ -6124,16 +7120,16 @@
           </w:tcPr>
           <w:p>
             <w:pPr>
-              <w:spacing w:after="40" w:line="264" w:lineRule="auto"/>
-              <w:jc w:val="center"/>
-            </w:pPr>
+              <w:spacing w:before="40" w:after="40"/>
+              <w:jc w:val="center"/>
+            </w:pPr>
+            <w:r/>
             <w:r>
               <w:rPr>
                 <w:rFonts w:ascii="Times New Roman" w:hAnsi="Times New Roman"/>
                 <w:b/>
-                <w:bCs/>
-                <w:sz w:val="19"/>
-                <w:szCs w:val="19"/>
+                <w:i w:val="0"/>
+                <w:sz w:val="19"/>
               </w:rPr>
               <w:t>PO2</w:t>
             </w:r>
@@ -6146,13 +7142,16 @@
           </w:tcPr>
           <w:p>
             <w:pPr>
-              <w:spacing w:after="40" w:line="264" w:lineRule="auto"/>
-            </w:pPr>
-            <w:r>
-              <w:rPr>
-                <w:rFonts w:ascii="Times New Roman" w:hAnsi="Times New Roman"/>
-                <w:sz w:val="19"/>
-                <w:szCs w:val="19"/>
+              <w:spacing w:before="40" w:after="40"/>
+              <w:jc w:val="left"/>
+            </w:pPr>
+            <w:r/>
+            <w:r>
+              <w:rPr>
+                <w:rFonts w:ascii="Times New Roman" w:hAnsi="Times New Roman"/>
+                <w:b/>
+                <w:i w:val="0"/>
+                <w:sz w:val="19"/>
               </w:rPr>
               <w:t>Problem Analysis</w:t>
             </w:r>
@@ -6165,15 +7164,18 @@
           </w:tcPr>
           <w:p>
             <w:pPr>
-              <w:spacing w:after="40" w:line="264" w:lineRule="auto"/>
-            </w:pPr>
-            <w:r>
-              <w:rPr>
-                <w:rFonts w:ascii="Times New Roman" w:hAnsi="Times New Roman"/>
-                <w:sz w:val="19"/>
-                <w:szCs w:val="19"/>
-              </w:rPr>
-              <w:t>Identify, formulate, review literature, analyse complex problems, first principles, substantiated conclusions, sustainable development</w:t>
+              <w:spacing w:before="40" w:after="40"/>
+              <w:jc w:val="left"/>
+            </w:pPr>
+            <w:r/>
+            <w:r>
+              <w:rPr>
+                <w:rFonts w:ascii="Times New Roman" w:hAnsi="Times New Roman"/>
+                <w:b w:val="0"/>
+                <w:i w:val="0"/>
+                <w:sz w:val="19"/>
+              </w:rPr>
+              <w:t>Identify, formulate, review research literature and analyze complex engineering problems reaching substantiated conclusions with consideration for sustainable development. (WK1 to WK4)</w:t>
             </w:r>
           </w:p>
         </w:tc>
@@ -6190,16 +7192,16 @@
           </w:tcPr>
           <w:p>
             <w:pPr>
-              <w:spacing w:after="40" w:line="264" w:lineRule="auto"/>
-              <w:jc w:val="center"/>
-            </w:pPr>
+              <w:spacing w:before="40" w:after="40"/>
+              <w:jc w:val="center"/>
+            </w:pPr>
+            <w:r/>
             <w:r>
               <w:rPr>
                 <w:rFonts w:ascii="Times New Roman" w:hAnsi="Times New Roman"/>
                 <w:b/>
-                <w:bCs/>
-                <w:sz w:val="19"/>
-                <w:szCs w:val="19"/>
+                <w:i w:val="0"/>
+                <w:sz w:val="19"/>
               </w:rPr>
               <w:t>PO3</w:t>
             </w:r>
@@ -6212,15 +7214,18 @@
           </w:tcPr>
           <w:p>
             <w:pPr>
-              <w:spacing w:after="40" w:line="264" w:lineRule="auto"/>
-            </w:pPr>
-            <w:r>
-              <w:rPr>
-                <w:rFonts w:ascii="Times New Roman" w:hAnsi="Times New Roman"/>
-                <w:sz w:val="19"/>
-                <w:szCs w:val="19"/>
-              </w:rPr>
-              <w:t>Design / Development of Solutions</w:t>
+              <w:spacing w:before="40" w:after="40"/>
+              <w:jc w:val="left"/>
+            </w:pPr>
+            <w:r/>
+            <w:r>
+              <w:rPr>
+                <w:rFonts w:ascii="Times New Roman" w:hAnsi="Times New Roman"/>
+                <w:b/>
+                <w:i w:val="0"/>
+                <w:sz w:val="19"/>
+              </w:rPr>
+              <w:t>Design/Development of Solutions</w:t>
             </w:r>
           </w:p>
         </w:tc>
@@ -6231,15 +7236,18 @@
           </w:tcPr>
           <w:p>
             <w:pPr>
-              <w:spacing w:after="40" w:line="264" w:lineRule="auto"/>
-            </w:pPr>
-            <w:r>
-              <w:rPr>
-                <w:rFonts w:ascii="Times New Roman" w:hAnsi="Times New Roman"/>
-                <w:sz w:val="19"/>
-                <w:szCs w:val="19"/>
-              </w:rPr>
-              <w:t>Design systems, components or processes for specified needs; public health and safety, whole-life cost, net zero carbon, culture, society, environment</w:t>
+              <w:spacing w:before="40" w:after="40"/>
+              <w:jc w:val="left"/>
+            </w:pPr>
+            <w:r/>
+            <w:r>
+              <w:rPr>
+                <w:rFonts w:ascii="Times New Roman" w:hAnsi="Times New Roman"/>
+                <w:b w:val="0"/>
+                <w:i w:val="0"/>
+                <w:sz w:val="19"/>
+              </w:rPr>
+              <w:t>Design creative solutions for complex engineering problems and design/develop systems/components/processes to meet identified needs with consideration for public health and safety, whole-life cost, net zero carbon, culture, society and environment as required. (WK5)</w:t>
             </w:r>
           </w:p>
         </w:tc>
@@ -6256,16 +7264,16 @@
           </w:tcPr>
           <w:p>
             <w:pPr>
-              <w:spacing w:after="40" w:line="264" w:lineRule="auto"/>
-              <w:jc w:val="center"/>
-            </w:pPr>
+              <w:spacing w:before="40" w:after="40"/>
+              <w:jc w:val="center"/>
+            </w:pPr>
+            <w:r/>
             <w:r>
               <w:rPr>
                 <w:rFonts w:ascii="Times New Roman" w:hAnsi="Times New Roman"/>
                 <w:b/>
-                <w:bCs/>
-                <w:sz w:val="19"/>
-                <w:szCs w:val="19"/>
+                <w:i w:val="0"/>
+                <w:sz w:val="19"/>
               </w:rPr>
               <w:t>PO4</w:t>
             </w:r>
@@ -6278,13 +7286,16 @@
           </w:tcPr>
           <w:p>
             <w:pPr>
-              <w:spacing w:after="40" w:line="264" w:lineRule="auto"/>
-            </w:pPr>
-            <w:r>
-              <w:rPr>
-                <w:rFonts w:ascii="Times New Roman" w:hAnsi="Times New Roman"/>
-                <w:sz w:val="19"/>
-                <w:szCs w:val="19"/>
+              <w:spacing w:before="40" w:after="40"/>
+              <w:jc w:val="left"/>
+            </w:pPr>
+            <w:r/>
+            <w:r>
+              <w:rPr>
+                <w:rFonts w:ascii="Times New Roman" w:hAnsi="Times New Roman"/>
+                <w:b/>
+                <w:i w:val="0"/>
+                <w:sz w:val="19"/>
               </w:rPr>
               <w:t>Conduct Investigations of Complex Problems</w:t>
             </w:r>
@@ -6297,15 +7308,18 @@
           </w:tcPr>
           <w:p>
             <w:pPr>
-              <w:spacing w:after="40" w:line="264" w:lineRule="auto"/>
-            </w:pPr>
-            <w:r>
-              <w:rPr>
-                <w:rFonts w:ascii="Times New Roman" w:hAnsi="Times New Roman"/>
-                <w:sz w:val="19"/>
-                <w:szCs w:val="19"/>
-              </w:rPr>
-              <w:t>Research-based methods, design of experiments, data analysis and interpretation, synthesis of information, valid conclusions</w:t>
+              <w:spacing w:before="40" w:after="40"/>
+              <w:jc w:val="left"/>
+            </w:pPr>
+            <w:r/>
+            <w:r>
+              <w:rPr>
+                <w:rFonts w:ascii="Times New Roman" w:hAnsi="Times New Roman"/>
+                <w:b w:val="0"/>
+                <w:i w:val="0"/>
+                <w:sz w:val="19"/>
+              </w:rPr>
+              <w:t>Conduct investigations of complex engineering problems using research-based knowledge including design of experiments, modelling, analysis &amp; interpretation of data to provide valid conclusions. (WK8)</w:t>
             </w:r>
           </w:p>
         </w:tc>
@@ -6322,16 +7336,16 @@
           </w:tcPr>
           <w:p>
             <w:pPr>
-              <w:spacing w:after="40" w:line="264" w:lineRule="auto"/>
-              <w:jc w:val="center"/>
-            </w:pPr>
+              <w:spacing w:before="40" w:after="40"/>
+              <w:jc w:val="center"/>
+            </w:pPr>
+            <w:r/>
             <w:r>
               <w:rPr>
                 <w:rFonts w:ascii="Times New Roman" w:hAnsi="Times New Roman"/>
                 <w:b/>
-                <w:bCs/>
-                <w:sz w:val="19"/>
-                <w:szCs w:val="19"/>
+                <w:i w:val="0"/>
+                <w:sz w:val="19"/>
               </w:rPr>
               <w:t>PO5</w:t>
             </w:r>
@@ -6344,13 +7358,16 @@
           </w:tcPr>
           <w:p>
             <w:pPr>
-              <w:spacing w:after="40" w:line="264" w:lineRule="auto"/>
-            </w:pPr>
-            <w:r>
-              <w:rPr>
-                <w:rFonts w:ascii="Times New Roman" w:hAnsi="Times New Roman"/>
-                <w:sz w:val="19"/>
-                <w:szCs w:val="19"/>
+              <w:spacing w:before="40" w:after="40"/>
+              <w:jc w:val="left"/>
+            </w:pPr>
+            <w:r/>
+            <w:r>
+              <w:rPr>
+                <w:rFonts w:ascii="Times New Roman" w:hAnsi="Times New Roman"/>
+                <w:b/>
+                <w:i w:val="0"/>
+                <w:sz w:val="19"/>
               </w:rPr>
               <w:t>Engineering Tool Usage</w:t>
             </w:r>
@@ -6363,15 +7380,18 @@
           </w:tcPr>
           <w:p>
             <w:pPr>
-              <w:spacing w:after="40" w:line="264" w:lineRule="auto"/>
-            </w:pPr>
-            <w:r>
-              <w:rPr>
-                <w:rFonts w:ascii="Times New Roman" w:hAnsi="Times New Roman"/>
-                <w:sz w:val="19"/>
-                <w:szCs w:val="19"/>
-              </w:rPr>
-              <w:t>Create, select and apply techniques, resources, modern engineering and IT tools; prediction, modelling, simulation; recognise limitations</w:t>
+              <w:spacing w:before="40" w:after="40"/>
+              <w:jc w:val="left"/>
+            </w:pPr>
+            <w:r/>
+            <w:r>
+              <w:rPr>
+                <w:rFonts w:ascii="Times New Roman" w:hAnsi="Times New Roman"/>
+                <w:b w:val="0"/>
+                <w:i w:val="0"/>
+                <w:sz w:val="19"/>
+              </w:rPr>
+              <w:t>Create, select and apply appropriate techniques, resources and modern engineering &amp; IT tools, including prediction and modelling recognizing their limitations to solve complex engineering problems. (WK2 and WK6)</w:t>
             </w:r>
           </w:p>
         </w:tc>
@@ -6388,16 +7408,16 @@
           </w:tcPr>
           <w:p>
             <w:pPr>
-              <w:spacing w:after="40" w:line="264" w:lineRule="auto"/>
-              <w:jc w:val="center"/>
-            </w:pPr>
+              <w:spacing w:before="40" w:after="40"/>
+              <w:jc w:val="center"/>
+            </w:pPr>
+            <w:r/>
             <w:r>
               <w:rPr>
                 <w:rFonts w:ascii="Times New Roman" w:hAnsi="Times New Roman"/>
                 <w:b/>
-                <w:bCs/>
-                <w:sz w:val="19"/>
-                <w:szCs w:val="19"/>
+                <w:i w:val="0"/>
+                <w:sz w:val="19"/>
               </w:rPr>
               <w:t>PO6</w:t>
             </w:r>
@@ -6410,13 +7430,16 @@
           </w:tcPr>
           <w:p>
             <w:pPr>
-              <w:spacing w:after="40" w:line="264" w:lineRule="auto"/>
-            </w:pPr>
-            <w:r>
-              <w:rPr>
-                <w:rFonts w:ascii="Times New Roman" w:hAnsi="Times New Roman"/>
-                <w:sz w:val="19"/>
-                <w:szCs w:val="19"/>
+              <w:spacing w:before="40" w:after="40"/>
+              <w:jc w:val="left"/>
+            </w:pPr>
+            <w:r/>
+            <w:r>
+              <w:rPr>
+                <w:rFonts w:ascii="Times New Roman" w:hAnsi="Times New Roman"/>
+                <w:b/>
+                <w:i w:val="0"/>
+                <w:sz w:val="19"/>
               </w:rPr>
               <w:t>The Engineer and The World</w:t>
             </w:r>
@@ -6429,15 +7452,18 @@
           </w:tcPr>
           <w:p>
             <w:pPr>
-              <w:spacing w:after="40" w:line="264" w:lineRule="auto"/>
-            </w:pPr>
-            <w:r>
-              <w:rPr>
-                <w:rFonts w:ascii="Times New Roman" w:hAnsi="Times New Roman"/>
-                <w:sz w:val="19"/>
-                <w:szCs w:val="19"/>
-              </w:rPr>
-              <w:t>Societal, environmental, health, safety, legal, cultural and economic impact; sustainability; UN SDGs</w:t>
+              <w:spacing w:before="40" w:after="40"/>
+              <w:jc w:val="left"/>
+            </w:pPr>
+            <w:r/>
+            <w:r>
+              <w:rPr>
+                <w:rFonts w:ascii="Times New Roman" w:hAnsi="Times New Roman"/>
+                <w:b w:val="0"/>
+                <w:i w:val="0"/>
+                <w:sz w:val="19"/>
+              </w:rPr>
+              <w:t>Analyze and evaluate societal and environmental aspects while solving complex engineering problems for its impact on sustainability with reference to economy, health, safety, legal framework, culture and environment. (WK1, WK5, and WK7)</w:t>
             </w:r>
           </w:p>
         </w:tc>
@@ -6454,16 +7480,16 @@
           </w:tcPr>
           <w:p>
             <w:pPr>
-              <w:spacing w:after="40" w:line="264" w:lineRule="auto"/>
-              <w:jc w:val="center"/>
-            </w:pPr>
+              <w:spacing w:before="40" w:after="40"/>
+              <w:jc w:val="center"/>
+            </w:pPr>
+            <w:r/>
             <w:r>
               <w:rPr>
                 <w:rFonts w:ascii="Times New Roman" w:hAnsi="Times New Roman"/>
                 <w:b/>
-                <w:bCs/>
-                <w:sz w:val="19"/>
-                <w:szCs w:val="19"/>
+                <w:i w:val="0"/>
+                <w:sz w:val="19"/>
               </w:rPr>
               <w:t>PO7</w:t>
             </w:r>
@@ -6476,13 +7502,16 @@
           </w:tcPr>
           <w:p>
             <w:pPr>
-              <w:spacing w:after="40" w:line="264" w:lineRule="auto"/>
-            </w:pPr>
-            <w:r>
-              <w:rPr>
-                <w:rFonts w:ascii="Times New Roman" w:hAnsi="Times New Roman"/>
-                <w:sz w:val="19"/>
-                <w:szCs w:val="19"/>
+              <w:spacing w:before="40" w:after="40"/>
+              <w:jc w:val="left"/>
+            </w:pPr>
+            <w:r/>
+            <w:r>
+              <w:rPr>
+                <w:rFonts w:ascii="Times New Roman" w:hAnsi="Times New Roman"/>
+                <w:b/>
+                <w:i w:val="0"/>
+                <w:sz w:val="19"/>
               </w:rPr>
               <w:t>Ethics</w:t>
             </w:r>
@@ -6495,15 +7524,18 @@
           </w:tcPr>
           <w:p>
             <w:pPr>
-              <w:spacing w:after="40" w:line="264" w:lineRule="auto"/>
-            </w:pPr>
-            <w:r>
-              <w:rPr>
-                <w:rFonts w:ascii="Times New Roman" w:hAnsi="Times New Roman"/>
-                <w:sz w:val="19"/>
-                <w:szCs w:val="19"/>
-              </w:rPr>
-              <w:t>Ethical principles, professional ethics and norms, human values, diversity and inclusion, national and international laws, IPR, data privacy</w:t>
+              <w:spacing w:before="40" w:after="40"/>
+              <w:jc w:val="left"/>
+            </w:pPr>
+            <w:r/>
+            <w:r>
+              <w:rPr>
+                <w:rFonts w:ascii="Times New Roman" w:hAnsi="Times New Roman"/>
+                <w:b w:val="0"/>
+                <w:i w:val="0"/>
+                <w:sz w:val="19"/>
+              </w:rPr>
+              <w:t>Apply ethical principles and commit to professional ethics, human values, diversity and inclusion; adhere to national &amp; international laws. (WK9)</w:t>
             </w:r>
           </w:p>
         </w:tc>
@@ -6520,16 +7552,16 @@
           </w:tcPr>
           <w:p>
             <w:pPr>
-              <w:spacing w:after="40" w:line="264" w:lineRule="auto"/>
-              <w:jc w:val="center"/>
-            </w:pPr>
+              <w:spacing w:before="40" w:after="40"/>
+              <w:jc w:val="center"/>
+            </w:pPr>
+            <w:r/>
             <w:r>
               <w:rPr>
                 <w:rFonts w:ascii="Times New Roman" w:hAnsi="Times New Roman"/>
                 <w:b/>
-                <w:bCs/>
-                <w:sz w:val="19"/>
-                <w:szCs w:val="19"/>
+                <w:i w:val="0"/>
+                <w:sz w:val="19"/>
               </w:rPr>
               <w:t>PO8</w:t>
             </w:r>
@@ -6542,15 +7574,18 @@
           </w:tcPr>
           <w:p>
             <w:pPr>
-              <w:spacing w:after="40" w:line="264" w:lineRule="auto"/>
-            </w:pPr>
-            <w:r>
-              <w:rPr>
-                <w:rFonts w:ascii="Times New Roman" w:hAnsi="Times New Roman"/>
-                <w:sz w:val="19"/>
-                <w:szCs w:val="19"/>
-              </w:rPr>
-              <w:t>Individual and Collaborative Team Work</w:t>
+              <w:spacing w:before="40" w:after="40"/>
+              <w:jc w:val="left"/>
+            </w:pPr>
+            <w:r/>
+            <w:r>
+              <w:rPr>
+                <w:rFonts w:ascii="Times New Roman" w:hAnsi="Times New Roman"/>
+                <w:b/>
+                <w:i w:val="0"/>
+                <w:sz w:val="19"/>
+              </w:rPr>
+              <w:t>Individual and Collaborative Team work</w:t>
             </w:r>
           </w:p>
         </w:tc>
@@ -6561,15 +7596,18 @@
           </w:tcPr>
           <w:p>
             <w:pPr>
-              <w:spacing w:after="40" w:line="264" w:lineRule="auto"/>
-            </w:pPr>
-            <w:r>
-              <w:rPr>
-                <w:rFonts w:ascii="Times New Roman" w:hAnsi="Times New Roman"/>
-                <w:sz w:val="19"/>
-                <w:szCs w:val="19"/>
-              </w:rPr>
-              <w:t>Function effectively as individual, member or leader; diverse, multidisciplinary, multicultural teams; collaboration</w:t>
+              <w:spacing w:before="40" w:after="40"/>
+              <w:jc w:val="left"/>
+            </w:pPr>
+            <w:r/>
+            <w:r>
+              <w:rPr>
+                <w:rFonts w:ascii="Times New Roman" w:hAnsi="Times New Roman"/>
+                <w:b w:val="0"/>
+                <w:i w:val="0"/>
+                <w:sz w:val="19"/>
+              </w:rPr>
+              <w:t>Function effectively as an individual, and as a member or leader in diverse/multi-disciplinary teams.</w:t>
             </w:r>
           </w:p>
         </w:tc>
@@ -6586,16 +7624,16 @@
           </w:tcPr>
           <w:p>
             <w:pPr>
-              <w:spacing w:after="40" w:line="264" w:lineRule="auto"/>
-              <w:jc w:val="center"/>
-            </w:pPr>
+              <w:spacing w:before="40" w:after="40"/>
+              <w:jc w:val="center"/>
+            </w:pPr>
+            <w:r/>
             <w:r>
               <w:rPr>
                 <w:rFonts w:ascii="Times New Roman" w:hAnsi="Times New Roman"/>
                 <w:b/>
-                <w:bCs/>
-                <w:sz w:val="19"/>
-                <w:szCs w:val="19"/>
+                <w:i w:val="0"/>
+                <w:sz w:val="19"/>
               </w:rPr>
               <w:t>PO9</w:t>
             </w:r>
@@ -6608,13 +7646,16 @@
           </w:tcPr>
           <w:p>
             <w:pPr>
-              <w:spacing w:after="40" w:line="264" w:lineRule="auto"/>
-            </w:pPr>
-            <w:r>
-              <w:rPr>
-                <w:rFonts w:ascii="Times New Roman" w:hAnsi="Times New Roman"/>
-                <w:sz w:val="19"/>
-                <w:szCs w:val="19"/>
+              <w:spacing w:before="40" w:after="40"/>
+              <w:jc w:val="left"/>
+            </w:pPr>
+            <w:r/>
+            <w:r>
+              <w:rPr>
+                <w:rFonts w:ascii="Times New Roman" w:hAnsi="Times New Roman"/>
+                <w:b/>
+                <w:i w:val="0"/>
+                <w:sz w:val="19"/>
               </w:rPr>
               <w:t>Communication</w:t>
             </w:r>
@@ -6627,15 +7668,18 @@
           </w:tcPr>
           <w:p>
             <w:pPr>
-              <w:spacing w:after="40" w:line="264" w:lineRule="auto"/>
-            </w:pPr>
-            <w:r>
-              <w:rPr>
-                <w:rFonts w:ascii="Times New Roman" w:hAnsi="Times New Roman"/>
-                <w:sz w:val="19"/>
-                <w:szCs w:val="19"/>
-              </w:rPr>
-              <w:t>Communicate effectively and inclusively; comprehend and write reports, design documentation, presentations; clear instructions</w:t>
+              <w:spacing w:before="40" w:after="40"/>
+              <w:jc w:val="left"/>
+            </w:pPr>
+            <w:r/>
+            <w:r>
+              <w:rPr>
+                <w:rFonts w:ascii="Times New Roman" w:hAnsi="Times New Roman"/>
+                <w:b w:val="0"/>
+                <w:i w:val="0"/>
+                <w:sz w:val="19"/>
+              </w:rPr>
+              <w:t>Communicate effectively and inclusively within the engineering community and society at large, such as being able to comprehend and write effective reports and design documentation, make effective presentations considering cultural, language, and learning differences.</w:t>
             </w:r>
           </w:p>
         </w:tc>
@@ -6652,16 +7696,16 @@
           </w:tcPr>
           <w:p>
             <w:pPr>
-              <w:spacing w:after="40" w:line="264" w:lineRule="auto"/>
-              <w:jc w:val="center"/>
-            </w:pPr>
+              <w:spacing w:before="40" w:after="40"/>
+              <w:jc w:val="center"/>
+            </w:pPr>
+            <w:r/>
             <w:r>
               <w:rPr>
                 <w:rFonts w:ascii="Times New Roman" w:hAnsi="Times New Roman"/>
                 <w:b/>
-                <w:bCs/>
-                <w:sz w:val="19"/>
-                <w:szCs w:val="19"/>
+                <w:i w:val="0"/>
+                <w:sz w:val="19"/>
               </w:rPr>
               <w:t>PO10</w:t>
             </w:r>
@@ -6674,13 +7718,16 @@
           </w:tcPr>
           <w:p>
             <w:pPr>
-              <w:spacing w:after="40" w:line="264" w:lineRule="auto"/>
-            </w:pPr>
-            <w:r>
-              <w:rPr>
-                <w:rFonts w:ascii="Times New Roman" w:hAnsi="Times New Roman"/>
-                <w:sz w:val="19"/>
-                <w:szCs w:val="19"/>
+              <w:spacing w:before="40" w:after="40"/>
+              <w:jc w:val="left"/>
+            </w:pPr>
+            <w:r/>
+            <w:r>
+              <w:rPr>
+                <w:rFonts w:ascii="Times New Roman" w:hAnsi="Times New Roman"/>
+                <w:b/>
+                <w:i w:val="0"/>
+                <w:sz w:val="19"/>
               </w:rPr>
               <w:t>Project Management and Finance</w:t>
             </w:r>
@@ -6693,15 +7740,18 @@
           </w:tcPr>
           <w:p>
             <w:pPr>
-              <w:spacing w:after="40" w:line="264" w:lineRule="auto"/>
-            </w:pPr>
-            <w:r>
-              <w:rPr>
-                <w:rFonts w:ascii="Times New Roman" w:hAnsi="Times New Roman"/>
-                <w:sz w:val="19"/>
-                <w:szCs w:val="19"/>
-              </w:rPr>
-              <w:t>Engineering management principles, economic decision-making, planning, scheduling, costing, risk; manage projects as member or leader</w:t>
+              <w:spacing w:before="40" w:after="40"/>
+              <w:jc w:val="left"/>
+            </w:pPr>
+            <w:r/>
+            <w:r>
+              <w:rPr>
+                <w:rFonts w:ascii="Times New Roman" w:hAnsi="Times New Roman"/>
+                <w:b w:val="0"/>
+                <w:i w:val="0"/>
+                <w:sz w:val="19"/>
+              </w:rPr>
+              <w:t>Apply knowledge and understanding of engineering management principles and economic decision-making and apply these to one's own work, as a member and leader in a team, and to manage projects and in multidisciplinary environments.</w:t>
             </w:r>
           </w:p>
         </w:tc>
@@ -6718,16 +7768,16 @@
           </w:tcPr>
           <w:p>
             <w:pPr>
-              <w:spacing w:after="40" w:line="264" w:lineRule="auto"/>
-              <w:jc w:val="center"/>
-            </w:pPr>
+              <w:spacing w:before="40" w:after="40"/>
+              <w:jc w:val="center"/>
+            </w:pPr>
+            <w:r/>
             <w:r>
               <w:rPr>
                 <w:rFonts w:ascii="Times New Roman" w:hAnsi="Times New Roman"/>
                 <w:b/>
-                <w:bCs/>
-                <w:sz w:val="19"/>
-                <w:szCs w:val="19"/>
+                <w:i w:val="0"/>
+                <w:sz w:val="19"/>
               </w:rPr>
               <w:t>PO11</w:t>
             </w:r>
@@ -6740,13 +7790,16 @@
           </w:tcPr>
           <w:p>
             <w:pPr>
-              <w:spacing w:after="40" w:line="264" w:lineRule="auto"/>
-            </w:pPr>
-            <w:r>
-              <w:rPr>
-                <w:rFonts w:ascii="Times New Roman" w:hAnsi="Times New Roman"/>
-                <w:sz w:val="19"/>
-                <w:szCs w:val="19"/>
+              <w:spacing w:before="40" w:after="40"/>
+              <w:jc w:val="left"/>
+            </w:pPr>
+            <w:r/>
+            <w:r>
+              <w:rPr>
+                <w:rFonts w:ascii="Times New Roman" w:hAnsi="Times New Roman"/>
+                <w:b/>
+                <w:i w:val="0"/>
+                <w:sz w:val="19"/>
               </w:rPr>
               <w:t>Life-Long Learning</w:t>
             </w:r>
@@ -6759,15 +7812,18 @@
           </w:tcPr>
           <w:p>
             <w:pPr>
-              <w:spacing w:after="40" w:line="264" w:lineRule="auto"/>
-            </w:pPr>
-            <w:r>
-              <w:rPr>
-                <w:rFonts w:ascii="Times New Roman" w:hAnsi="Times New Roman"/>
-                <w:sz w:val="19"/>
-                <w:szCs w:val="19"/>
-              </w:rPr>
-              <w:t>Recognise the need for independent learning, adaptability to new and emerging technologies, critical thinking, broadest context of technological change</w:t>
+              <w:spacing w:before="40" w:after="40"/>
+              <w:jc w:val="left"/>
+            </w:pPr>
+            <w:r/>
+            <w:r>
+              <w:rPr>
+                <w:rFonts w:ascii="Times New Roman" w:hAnsi="Times New Roman"/>
+                <w:b w:val="0"/>
+                <w:i w:val="0"/>
+                <w:sz w:val="19"/>
+              </w:rPr>
+              <w:t>Recognize the need for, and have the preparation and ability for i) independent and life-long learning ii) adaptability to new and emerging technologies and iii) critical thinking in the broadest context of technological change. (WK8)</w:t>
             </w:r>
           </w:p>
         </w:tc>
@@ -6870,15 +7926,16 @@
           </w:tcPr>
           <w:p>
             <w:pPr>
-              <w:keepNext/>
-              <w:spacing w:after="40" w:line="264" w:lineRule="auto"/>
-              <w:jc w:val="center"/>
-            </w:pPr>
-            <w:r>
-              <w:rPr>
-                <w:rFonts w:ascii="Times New Roman" w:hAnsi="Times New Roman"/>
-                <w:sz w:val="21"/>
-                <w:szCs w:val="21"/>
+              <w:spacing w:before="40" w:after="40"/>
+              <w:jc w:val="center"/>
+            </w:pPr>
+            <w:r/>
+            <w:r>
+              <w:rPr>
+                <w:rFonts w:ascii="Times New Roman" w:hAnsi="Times New Roman"/>
+                <w:b/>
+                <w:i w:val="0"/>
+                <w:sz w:val="19"/>
               </w:rPr>
               <w:t>PSO1</w:t>
             </w:r>
@@ -6891,9 +7948,19 @@
           </w:tcPr>
           <w:p>
             <w:pPr>
-              <w:keepNext/>
-              <w:spacing w:after="40" w:line="264" w:lineRule="auto"/>
-            </w:pPr>
+              <w:spacing w:before="40" w:after="40"/>
+              <w:jc w:val="left"/>
+            </w:pPr>
+            <w:r/>
+            <w:r>
+              <w:rPr>
+                <w:rFonts w:ascii="Times New Roman" w:hAnsi="Times New Roman"/>
+                <w:b w:val="0"/>
+                <w:i w:val="0"/>
+                <w:sz w:val="19"/>
+              </w:rPr>
+              <w:t>Design, develop and deploy intelligent models and systems using machine learning, deep learning, and data analytics tools to solve real-world problems.</w:t>
+            </w:r>
           </w:p>
         </w:tc>
       </w:tr>
@@ -6910,14 +7977,16 @@
           </w:tcPr>
           <w:p>
             <w:pPr>
-              <w:spacing w:after="40" w:line="264" w:lineRule="auto"/>
-              <w:jc w:val="center"/>
-            </w:pPr>
-            <w:r>
-              <w:rPr>
-                <w:rFonts w:ascii="Times New Roman" w:hAnsi="Times New Roman"/>
-                <w:sz w:val="21"/>
-                <w:szCs w:val="21"/>
+              <w:spacing w:before="40" w:after="40"/>
+              <w:jc w:val="center"/>
+            </w:pPr>
+            <w:r/>
+            <w:r>
+              <w:rPr>
+                <w:rFonts w:ascii="Times New Roman" w:hAnsi="Times New Roman"/>
+                <w:b/>
+                <w:i w:val="0"/>
+                <w:sz w:val="19"/>
               </w:rPr>
               <w:t>PSO2</w:t>
             </w:r>
@@ -6930,8 +7999,19 @@
           </w:tcPr>
           <w:p>
             <w:pPr>
-              <w:spacing w:after="40" w:line="264" w:lineRule="auto"/>
-            </w:pPr>
+              <w:spacing w:before="40" w:after="40"/>
+              <w:jc w:val="left"/>
+            </w:pPr>
+            <w:r/>
+            <w:r>
+              <w:rPr>
+                <w:rFonts w:ascii="Times New Roman" w:hAnsi="Times New Roman"/>
+                <w:b w:val="0"/>
+                <w:i w:val="0"/>
+                <w:sz w:val="19"/>
+              </w:rPr>
+              <w:t>Apply artificial intelligence techniques to domain-specific applications, ensuring ethical, secure, scalable and responsible software systems.</w:t>
+            </w:r>
           </w:p>
         </w:tc>
       </w:tr>

</xml_diff>